<commit_message>
some final tweaks to presentation and passport and .exe of the game
</commit_message>
<xml_diff>
--- a/passport.docx
+++ b/passport.docx
@@ -84,6 +84,7 @@
                 <w:lang w:val="en-US"/>
               </w:rPr>
             </w:pPr>
+            <w:proofErr w:type="spellStart"/>
             <w:r>
               <w:rPr>
                 <w:rFonts w:ascii="Times New Roman" w:eastAsia="Times New Roman" w:hAnsi="Times New Roman" w:cs="Times New Roman"/>
@@ -93,6 +94,7 @@
               </w:rPr>
               <w:t>Olimpium</w:t>
             </w:r>
+            <w:proofErr w:type="spellEnd"/>
           </w:p>
         </w:tc>
       </w:tr>
@@ -137,6 +139,7 @@
                 <w:lang w:val="en-US"/>
               </w:rPr>
             </w:pPr>
+            <w:proofErr w:type="spellStart"/>
             <w:r>
               <w:rPr>
                 <w:rFonts w:ascii="Times New Roman" w:eastAsia="Times New Roman" w:hAnsi="Times New Roman" w:cs="Times New Roman"/>
@@ -146,6 +149,7 @@
               </w:rPr>
               <w:t>Congame</w:t>
             </w:r>
+            <w:proofErr w:type="spellEnd"/>
           </w:p>
         </w:tc>
       </w:tr>
@@ -233,11 +237,164 @@
           </w:tcPr>
           <w:p>
             <w:pPr>
+              <w:shd w:val="clear" w:color="auto" w:fill="FFFFFF"/>
+              <w:spacing w:after="0" w:line="240" w:lineRule="auto"/>
+              <w:rPr>
+                <w:rFonts w:ascii="Arial" w:eastAsia="Times New Roman" w:hAnsi="Arial" w:cs="Arial"/>
+                <w:color w:val="34343C"/>
+                <w:sz w:val="23"/>
+                <w:szCs w:val="23"/>
+                <w:lang w:eastAsia="ru-RU"/>
+              </w:rPr>
+            </w:pPr>
+            <w:r>
+              <w:rPr>
+                <w:rFonts w:ascii="Arial" w:eastAsia="Times New Roman" w:hAnsi="Arial" w:cs="Arial"/>
+                <w:color w:val="34343C"/>
+                <w:sz w:val="23"/>
+                <w:szCs w:val="23"/>
+                <w:lang w:eastAsia="ru-RU"/>
+              </w:rPr>
+              <w:t xml:space="preserve">Консольное приложение игра </w:t>
+            </w:r>
+            <w:proofErr w:type="spellStart"/>
+            <w:r>
+              <w:rPr>
+                <w:rFonts w:ascii="Arial" w:eastAsia="Times New Roman" w:hAnsi="Arial" w:cs="Arial"/>
+                <w:color w:val="34343C"/>
+                <w:sz w:val="23"/>
+                <w:szCs w:val="23"/>
+                <w:lang w:val="en-US" w:eastAsia="ru-RU"/>
+              </w:rPr>
+              <w:t>Congame</w:t>
+            </w:r>
+            <w:proofErr w:type="spellEnd"/>
+            <w:r>
+              <w:rPr>
+                <w:rFonts w:ascii="Arial" w:eastAsia="Times New Roman" w:hAnsi="Arial" w:cs="Arial"/>
+                <w:color w:val="34343C"/>
+                <w:sz w:val="23"/>
+                <w:szCs w:val="23"/>
+                <w:lang w:eastAsia="ru-RU"/>
+              </w:rPr>
+              <w:t>», разработанная на языке</w:t>
+            </w:r>
+          </w:p>
+          <w:p>
+            <w:pPr>
+              <w:shd w:val="clear" w:color="auto" w:fill="FFFFFF"/>
+              <w:spacing w:after="0" w:line="240" w:lineRule="auto"/>
+              <w:rPr>
+                <w:rFonts w:ascii="Arial" w:eastAsia="Times New Roman" w:hAnsi="Arial" w:cs="Arial"/>
+                <w:color w:val="34343C"/>
+                <w:sz w:val="23"/>
+                <w:szCs w:val="23"/>
+                <w:lang w:eastAsia="ru-RU"/>
+              </w:rPr>
+            </w:pPr>
+            <w:r>
+              <w:rPr>
+                <w:rFonts w:ascii="Arial" w:eastAsia="Times New Roman" w:hAnsi="Arial" w:cs="Arial"/>
+                <w:color w:val="34343C"/>
+                <w:sz w:val="23"/>
+                <w:szCs w:val="23"/>
+                <w:lang w:eastAsia="ru-RU"/>
+              </w:rPr>
+              <w:t>программирования Python с использованием системы контроля</w:t>
+            </w:r>
+          </w:p>
+          <w:p>
+            <w:pPr>
+              <w:shd w:val="clear" w:color="auto" w:fill="FFFFFF"/>
+              <w:spacing w:after="0" w:line="240" w:lineRule="auto"/>
+              <w:rPr>
+                <w:rFonts w:ascii="Arial" w:eastAsia="Times New Roman" w:hAnsi="Arial" w:cs="Arial"/>
+                <w:color w:val="34343C"/>
+                <w:sz w:val="23"/>
+                <w:szCs w:val="23"/>
+                <w:lang w:eastAsia="ru-RU"/>
+              </w:rPr>
+            </w:pPr>
+            <w:r>
+              <w:rPr>
+                <w:rFonts w:ascii="Arial" w:eastAsia="Times New Roman" w:hAnsi="Arial" w:cs="Arial"/>
+                <w:color w:val="34343C"/>
+                <w:sz w:val="23"/>
+                <w:szCs w:val="23"/>
+                <w:lang w:eastAsia="ru-RU"/>
+              </w:rPr>
+              <w:t xml:space="preserve">версий </w:t>
+            </w:r>
+            <w:proofErr w:type="spellStart"/>
+            <w:r>
+              <w:rPr>
+                <w:rFonts w:ascii="Arial" w:eastAsia="Times New Roman" w:hAnsi="Arial" w:cs="Arial"/>
+                <w:color w:val="34343C"/>
+                <w:sz w:val="23"/>
+                <w:szCs w:val="23"/>
+                <w:lang w:eastAsia="ru-RU"/>
+              </w:rPr>
+              <w:t>Git</w:t>
+            </w:r>
+            <w:proofErr w:type="spellEnd"/>
+            <w:r>
+              <w:rPr>
+                <w:rFonts w:ascii="Arial" w:eastAsia="Times New Roman" w:hAnsi="Arial" w:cs="Arial"/>
+                <w:color w:val="34343C"/>
+                <w:sz w:val="23"/>
+                <w:szCs w:val="23"/>
+                <w:lang w:eastAsia="ru-RU"/>
+              </w:rPr>
+              <w:t xml:space="preserve">, опубликованное на </w:t>
+            </w:r>
+            <w:proofErr w:type="spellStart"/>
+            <w:r>
+              <w:rPr>
+                <w:rFonts w:ascii="Arial" w:eastAsia="Times New Roman" w:hAnsi="Arial" w:cs="Arial"/>
+                <w:color w:val="34343C"/>
+                <w:sz w:val="23"/>
+                <w:szCs w:val="23"/>
+                <w:lang w:eastAsia="ru-RU"/>
+              </w:rPr>
+              <w:t>GitHub</w:t>
+            </w:r>
+            <w:proofErr w:type="spellEnd"/>
+            <w:r>
+              <w:rPr>
+                <w:rFonts w:ascii="Arial" w:eastAsia="Times New Roman" w:hAnsi="Arial" w:cs="Arial"/>
+                <w:color w:val="34343C"/>
+                <w:sz w:val="23"/>
+                <w:szCs w:val="23"/>
+                <w:lang w:eastAsia="ru-RU"/>
+              </w:rPr>
+              <w:t xml:space="preserve"> (</w:t>
+            </w:r>
+            <w:r>
+              <w:rPr>
+                <w:rFonts w:ascii="Arial" w:eastAsia="Times New Roman" w:hAnsi="Arial" w:cs="Arial"/>
+                <w:color w:val="34343C"/>
+                <w:sz w:val="23"/>
+                <w:szCs w:val="23"/>
+                <w:lang w:eastAsia="ru-RU"/>
+              </w:rPr>
+              <w:t>https://github.com/f3f44/ConGame/tree/main</w:t>
+            </w:r>
+            <w:r>
+              <w:rPr>
+                <w:rFonts w:ascii="Arial" w:eastAsia="Times New Roman" w:hAnsi="Arial" w:cs="Arial"/>
+                <w:color w:val="34343C"/>
+                <w:sz w:val="23"/>
+                <w:szCs w:val="23"/>
+                <w:lang w:eastAsia="ru-RU"/>
+              </w:rPr>
+              <w:t>)</w:t>
+            </w:r>
+          </w:p>
+          <w:p>
+            <w:pPr>
               <w:spacing w:line="360" w:lineRule="auto"/>
               <w:rPr>
-                <w:rFonts w:ascii="Times New Roman" w:eastAsia="Times New Roman" w:hAnsi="Times New Roman" w:cs="Times New Roman"/>
-                <w:sz w:val="24"/>
-                <w:szCs w:val="24"/>
+                <w:noProof/>
               </w:rPr>
             </w:pPr>
           </w:p>
@@ -324,6 +481,7 @@
               </w:rPr>
               <w:t xml:space="preserve">Обучение использования </w:t>
             </w:r>
+            <w:proofErr w:type="spellStart"/>
             <w:r>
               <w:rPr>
                 <w:rFonts w:ascii="Times New Roman" w:eastAsia="Times New Roman" w:hAnsi="Times New Roman" w:cs="Times New Roman"/>
@@ -333,6 +491,7 @@
               </w:rPr>
               <w:t>github</w:t>
             </w:r>
+            <w:proofErr w:type="spellEnd"/>
             <w:r>
               <w:rPr>
                 <w:rFonts w:ascii="Times New Roman" w:eastAsia="Times New Roman" w:hAnsi="Times New Roman" w:cs="Times New Roman"/>
@@ -382,6 +541,22 @@
                 <w:lang w:val="en-US"/>
               </w:rPr>
               <w:t>python</w:t>
+            </w:r>
+            <w:r>
+              <w:rPr>
+                <w:rFonts w:ascii="Times New Roman" w:eastAsia="Times New Roman" w:hAnsi="Times New Roman" w:cs="Times New Roman"/>
+                <w:sz w:val="24"/>
+                <w:szCs w:val="24"/>
+              </w:rPr>
+              <w:t xml:space="preserve"> </w:t>
+            </w:r>
+            <w:r>
+              <w:rPr>
+                <w:rFonts w:ascii="Times New Roman" w:eastAsia="Times New Roman" w:hAnsi="Times New Roman" w:cs="Times New Roman"/>
+                <w:sz w:val="24"/>
+                <w:szCs w:val="24"/>
+              </w:rPr>
+              <w:t>и окончание 4 модуля</w:t>
             </w:r>
           </w:p>
         </w:tc>
@@ -431,6 +606,7 @@
               </w:rPr>
               <w:t xml:space="preserve">Обучение использования </w:t>
             </w:r>
+            <w:proofErr w:type="spellStart"/>
             <w:r>
               <w:rPr>
                 <w:rFonts w:ascii="Times New Roman" w:eastAsia="Times New Roman" w:hAnsi="Times New Roman" w:cs="Times New Roman"/>
@@ -440,6 +616,7 @@
               </w:rPr>
               <w:t>github</w:t>
             </w:r>
+            <w:proofErr w:type="spellEnd"/>
             <w:r>
               <w:rPr>
                 <w:rFonts w:ascii="Times New Roman" w:eastAsia="Times New Roman" w:hAnsi="Times New Roman" w:cs="Times New Roman"/>
@@ -489,6 +666,22 @@
                 <w:lang w:val="en-US"/>
               </w:rPr>
               <w:t>python</w:t>
+            </w:r>
+            <w:r>
+              <w:rPr>
+                <w:rFonts w:ascii="Times New Roman" w:eastAsia="Times New Roman" w:hAnsi="Times New Roman" w:cs="Times New Roman"/>
+                <w:sz w:val="24"/>
+                <w:szCs w:val="24"/>
+              </w:rPr>
+              <w:t xml:space="preserve"> </w:t>
+            </w:r>
+            <w:r>
+              <w:rPr>
+                <w:rFonts w:ascii="Times New Roman" w:eastAsia="Times New Roman" w:hAnsi="Times New Roman" w:cs="Times New Roman"/>
+                <w:sz w:val="24"/>
+                <w:szCs w:val="24"/>
+              </w:rPr>
+              <w:t>и окончание 4 модуля</w:t>
             </w:r>
           </w:p>
         </w:tc>
@@ -530,14 +723,25 @@
                 <w:szCs w:val="24"/>
               </w:rPr>
             </w:pPr>
+            <w:proofErr w:type="gramStart"/>
             <w:r>
               <w:rPr>
                 <w:rFonts w:ascii="Times New Roman" w:eastAsia="Times New Roman" w:hAnsi="Times New Roman" w:cs="Times New Roman"/>
                 <w:sz w:val="24"/>
                 <w:szCs w:val="24"/>
               </w:rPr>
-              <w:t xml:space="preserve">Научиться  использовать </w:t>
+              <w:t>Научиться  использовать</w:t>
             </w:r>
+            <w:proofErr w:type="gramEnd"/>
+            <w:r>
+              <w:rPr>
+                <w:rFonts w:ascii="Times New Roman" w:eastAsia="Times New Roman" w:hAnsi="Times New Roman" w:cs="Times New Roman"/>
+                <w:sz w:val="24"/>
+                <w:szCs w:val="24"/>
+              </w:rPr>
+              <w:t xml:space="preserve"> </w:t>
+            </w:r>
+            <w:proofErr w:type="spellStart"/>
             <w:r>
               <w:rPr>
                 <w:rFonts w:ascii="Times New Roman" w:eastAsia="Times New Roman" w:hAnsi="Times New Roman" w:cs="Times New Roman"/>
@@ -547,6 +751,7 @@
               </w:rPr>
               <w:t>github</w:t>
             </w:r>
+            <w:proofErr w:type="spellEnd"/>
             <w:r>
               <w:rPr>
                 <w:rFonts w:ascii="Times New Roman" w:eastAsia="Times New Roman" w:hAnsi="Times New Roman" w:cs="Times New Roman"/>
@@ -596,6 +801,22 @@
                 <w:lang w:val="en-US"/>
               </w:rPr>
               <w:t>python</w:t>
+            </w:r>
+            <w:r>
+              <w:rPr>
+                <w:rFonts w:ascii="Times New Roman" w:eastAsia="Times New Roman" w:hAnsi="Times New Roman" w:cs="Times New Roman"/>
+                <w:sz w:val="24"/>
+                <w:szCs w:val="24"/>
+              </w:rPr>
+              <w:t xml:space="preserve"> </w:t>
+            </w:r>
+            <w:r>
+              <w:rPr>
+                <w:rFonts w:ascii="Times New Roman" w:eastAsia="Times New Roman" w:hAnsi="Times New Roman" w:cs="Times New Roman"/>
+                <w:sz w:val="24"/>
+                <w:szCs w:val="24"/>
+              </w:rPr>
+              <w:t>и окончание 4 модуля</w:t>
             </w:r>
           </w:p>
         </w:tc>
@@ -691,7 +912,59 @@
                 <w:sz w:val="24"/>
                 <w:szCs w:val="24"/>
               </w:rPr>
-              <w:t>Рабочий проект</w:t>
+              <w:t xml:space="preserve">Навыки использования </w:t>
+            </w:r>
+            <w:r>
+              <w:rPr>
+                <w:rFonts w:ascii="Times New Roman" w:eastAsia="Times New Roman" w:hAnsi="Times New Roman" w:cs="Times New Roman"/>
+                <w:sz w:val="24"/>
+                <w:szCs w:val="24"/>
+                <w:lang w:val="en-US"/>
+              </w:rPr>
+              <w:t>git</w:t>
+            </w:r>
+            <w:r>
+              <w:rPr>
+                <w:rFonts w:ascii="Times New Roman" w:eastAsia="Times New Roman" w:hAnsi="Times New Roman" w:cs="Times New Roman"/>
+                <w:sz w:val="24"/>
+                <w:szCs w:val="24"/>
+              </w:rPr>
+              <w:t xml:space="preserve"> </w:t>
+            </w:r>
+            <w:r>
+              <w:rPr>
+                <w:rFonts w:ascii="Times New Roman" w:eastAsia="Times New Roman" w:hAnsi="Times New Roman" w:cs="Times New Roman"/>
+                <w:sz w:val="24"/>
+                <w:szCs w:val="24"/>
+              </w:rPr>
+              <w:t xml:space="preserve">и </w:t>
+            </w:r>
+            <w:proofErr w:type="spellStart"/>
+            <w:r>
+              <w:rPr>
+                <w:rFonts w:ascii="Times New Roman" w:eastAsia="Times New Roman" w:hAnsi="Times New Roman" w:cs="Times New Roman"/>
+                <w:sz w:val="24"/>
+                <w:szCs w:val="24"/>
+                <w:lang w:val="en-US"/>
+              </w:rPr>
+              <w:t>github</w:t>
+            </w:r>
+            <w:proofErr w:type="spellEnd"/>
+            <w:r>
+              <w:rPr>
+                <w:rFonts w:ascii="Times New Roman" w:eastAsia="Times New Roman" w:hAnsi="Times New Roman" w:cs="Times New Roman"/>
+                <w:sz w:val="24"/>
+                <w:szCs w:val="24"/>
+              </w:rPr>
+              <w:t xml:space="preserve"> </w:t>
+            </w:r>
+            <w:r>
+              <w:rPr>
+                <w:rFonts w:ascii="Times New Roman" w:eastAsia="Times New Roman" w:hAnsi="Times New Roman" w:cs="Times New Roman"/>
+                <w:sz w:val="24"/>
+                <w:szCs w:val="24"/>
+              </w:rPr>
+              <w:t>для реализации и презентования проекта</w:t>
             </w:r>
           </w:p>
         </w:tc>
@@ -952,6 +1225,7 @@
                 <w:sz w:val="24"/>
                 <w:szCs w:val="24"/>
               </w:rPr>
+              <w:lastRenderedPageBreak/>
               <w:t>Заключительный этап</w:t>
             </w:r>
           </w:p>
@@ -975,7 +1249,25 @@
                 <w:sz w:val="24"/>
                 <w:szCs w:val="24"/>
               </w:rPr>
-              <w:t>- оформить окончательнный проект</w:t>
+              <w:t xml:space="preserve">- оформить </w:t>
+            </w:r>
+            <w:proofErr w:type="spellStart"/>
+            <w:r>
+              <w:rPr>
+                <w:rFonts w:ascii="Times New Roman" w:eastAsia="Times New Roman" w:hAnsi="Times New Roman" w:cs="Times New Roman"/>
+                <w:sz w:val="24"/>
+                <w:szCs w:val="24"/>
+              </w:rPr>
+              <w:t>окончательнный</w:t>
+            </w:r>
+            <w:proofErr w:type="spellEnd"/>
+            <w:r>
+              <w:rPr>
+                <w:rFonts w:ascii="Times New Roman" w:eastAsia="Times New Roman" w:hAnsi="Times New Roman" w:cs="Times New Roman"/>
+                <w:sz w:val="24"/>
+                <w:szCs w:val="24"/>
+              </w:rPr>
+              <w:t xml:space="preserve"> проект</w:t>
             </w:r>
           </w:p>
           <w:p>
@@ -1036,7 +1328,6 @@
                 <w:sz w:val="24"/>
                 <w:szCs w:val="24"/>
               </w:rPr>
-              <w:lastRenderedPageBreak/>
               <w:t>Формализация алгоритма</w:t>
             </w:r>
           </w:p>
@@ -1057,6 +1348,7 @@
             <w:r>
               <w:rPr>
                 <w:rFonts w:ascii="Times New Roman" w:eastAsia="Times New Roman" w:hAnsi="Times New Roman" w:cs="Times New Roman"/>
+                <w:noProof/>
                 <w:sz w:val="24"/>
                 <w:szCs w:val="24"/>
               </w:rPr>
@@ -1153,6 +1445,7 @@
                 <w:rFonts w:ascii="Times New Roman" w:eastAsia="Times New Roman" w:hAnsi="Times New Roman" w:cs="Times New Roman"/>
                 <w:sz w:val="24"/>
                 <w:szCs w:val="24"/>
+                <w:lang w:val="en-US"/>
               </w:rPr>
             </w:pPr>
             <w:r>
@@ -1160,8 +1453,1496 @@
                 <w:rFonts w:ascii="Times New Roman" w:eastAsia="Times New Roman" w:hAnsi="Times New Roman" w:cs="Times New Roman"/>
                 <w:sz w:val="24"/>
                 <w:szCs w:val="24"/>
-              </w:rPr>
-              <w:t>https://github.com/f3f44/ConGame</w:t>
+                <w:lang w:val="en-US"/>
+              </w:rPr>
+              <w:t>while run:</w:t>
+            </w:r>
+          </w:p>
+          <w:p>
+            <w:pPr>
+              <w:spacing w:line="360" w:lineRule="auto"/>
+              <w:rPr>
+                <w:rFonts w:ascii="Times New Roman" w:eastAsia="Times New Roman" w:hAnsi="Times New Roman" w:cs="Times New Roman"/>
+                <w:sz w:val="24"/>
+                <w:szCs w:val="24"/>
+                <w:lang w:val="en-US"/>
+              </w:rPr>
+            </w:pPr>
+            <w:r>
+              <w:rPr>
+                <w:rFonts w:ascii="Times New Roman" w:eastAsia="Times New Roman" w:hAnsi="Times New Roman" w:cs="Times New Roman"/>
+                <w:sz w:val="24"/>
+                <w:szCs w:val="24"/>
+                <w:lang w:val="en-US"/>
+              </w:rPr>
+              <w:t xml:space="preserve">        if </w:t>
+            </w:r>
+            <w:proofErr w:type="spellStart"/>
+            <w:r>
+              <w:rPr>
+                <w:rFonts w:ascii="Times New Roman" w:eastAsia="Times New Roman" w:hAnsi="Times New Roman" w:cs="Times New Roman"/>
+                <w:sz w:val="24"/>
+                <w:szCs w:val="24"/>
+                <w:lang w:val="en-US"/>
+              </w:rPr>
+              <w:t>k.is_pressed</w:t>
+            </w:r>
+            <w:proofErr w:type="spellEnd"/>
+            <w:r>
+              <w:rPr>
+                <w:rFonts w:ascii="Times New Roman" w:eastAsia="Times New Roman" w:hAnsi="Times New Roman" w:cs="Times New Roman"/>
+                <w:sz w:val="24"/>
+                <w:szCs w:val="24"/>
+                <w:lang w:val="en-US"/>
+              </w:rPr>
+              <w:t>('esc'):</w:t>
+            </w:r>
+          </w:p>
+          <w:p>
+            <w:pPr>
+              <w:spacing w:line="360" w:lineRule="auto"/>
+              <w:rPr>
+                <w:rFonts w:ascii="Times New Roman" w:eastAsia="Times New Roman" w:hAnsi="Times New Roman" w:cs="Times New Roman"/>
+                <w:sz w:val="24"/>
+                <w:szCs w:val="24"/>
+                <w:lang w:val="en-US"/>
+              </w:rPr>
+            </w:pPr>
+            <w:r>
+              <w:rPr>
+                <w:rFonts w:ascii="Times New Roman" w:eastAsia="Times New Roman" w:hAnsi="Times New Roman" w:cs="Times New Roman"/>
+                <w:sz w:val="24"/>
+                <w:szCs w:val="24"/>
+                <w:lang w:val="en-US"/>
+              </w:rPr>
+              <w:t xml:space="preserve">            break</w:t>
+            </w:r>
+          </w:p>
+          <w:p>
+            <w:pPr>
+              <w:spacing w:line="360" w:lineRule="auto"/>
+              <w:rPr>
+                <w:rFonts w:ascii="Times New Roman" w:eastAsia="Times New Roman" w:hAnsi="Times New Roman" w:cs="Times New Roman"/>
+                <w:sz w:val="24"/>
+                <w:szCs w:val="24"/>
+                <w:lang w:val="en-US"/>
+              </w:rPr>
+            </w:pPr>
+            <w:r>
+              <w:rPr>
+                <w:rFonts w:ascii="Times New Roman" w:eastAsia="Times New Roman" w:hAnsi="Times New Roman" w:cs="Times New Roman"/>
+                <w:sz w:val="24"/>
+                <w:szCs w:val="24"/>
+                <w:lang w:val="en-US"/>
+              </w:rPr>
+              <w:t xml:space="preserve">        </w:t>
+            </w:r>
+          </w:p>
+          <w:p>
+            <w:pPr>
+              <w:spacing w:line="360" w:lineRule="auto"/>
+              <w:rPr>
+                <w:rFonts w:ascii="Times New Roman" w:eastAsia="Times New Roman" w:hAnsi="Times New Roman" w:cs="Times New Roman"/>
+                <w:sz w:val="24"/>
+                <w:szCs w:val="24"/>
+                <w:lang w:val="en-US"/>
+              </w:rPr>
+            </w:pPr>
+            <w:r>
+              <w:rPr>
+                <w:rFonts w:ascii="Times New Roman" w:eastAsia="Times New Roman" w:hAnsi="Times New Roman" w:cs="Times New Roman"/>
+                <w:sz w:val="24"/>
+                <w:szCs w:val="24"/>
+                <w:lang w:val="en-US"/>
+              </w:rPr>
+              <w:t xml:space="preserve">        render = f'\033[H'</w:t>
+            </w:r>
+          </w:p>
+          <w:p>
+            <w:pPr>
+              <w:spacing w:line="360" w:lineRule="auto"/>
+              <w:rPr>
+                <w:rFonts w:ascii="Times New Roman" w:eastAsia="Times New Roman" w:hAnsi="Times New Roman" w:cs="Times New Roman"/>
+                <w:sz w:val="24"/>
+                <w:szCs w:val="24"/>
+                <w:lang w:val="en-US"/>
+              </w:rPr>
+            </w:pPr>
+            <w:r>
+              <w:rPr>
+                <w:rFonts w:ascii="Times New Roman" w:eastAsia="Times New Roman" w:hAnsi="Times New Roman" w:cs="Times New Roman"/>
+                <w:sz w:val="24"/>
+                <w:szCs w:val="24"/>
+                <w:lang w:val="en-US"/>
+              </w:rPr>
+              <w:t xml:space="preserve">        </w:t>
+            </w:r>
+          </w:p>
+          <w:p>
+            <w:pPr>
+              <w:spacing w:line="360" w:lineRule="auto"/>
+              <w:rPr>
+                <w:rFonts w:ascii="Times New Roman" w:eastAsia="Times New Roman" w:hAnsi="Times New Roman" w:cs="Times New Roman"/>
+                <w:sz w:val="24"/>
+                <w:szCs w:val="24"/>
+                <w:lang w:val="en-US"/>
+              </w:rPr>
+            </w:pPr>
+            <w:r>
+              <w:rPr>
+                <w:rFonts w:ascii="Times New Roman" w:eastAsia="Times New Roman" w:hAnsi="Times New Roman" w:cs="Times New Roman"/>
+                <w:sz w:val="24"/>
+                <w:szCs w:val="24"/>
+                <w:lang w:val="en-US"/>
+              </w:rPr>
+              <w:t xml:space="preserve">        if </w:t>
+            </w:r>
+            <w:proofErr w:type="gramStart"/>
+            <w:r>
+              <w:rPr>
+                <w:rFonts w:ascii="Times New Roman" w:eastAsia="Times New Roman" w:hAnsi="Times New Roman" w:cs="Times New Roman"/>
+                <w:sz w:val="24"/>
+                <w:szCs w:val="24"/>
+                <w:lang w:val="en-US"/>
+              </w:rPr>
+              <w:t>mode !</w:t>
+            </w:r>
+            <w:proofErr w:type="gramEnd"/>
+            <w:r>
+              <w:rPr>
+                <w:rFonts w:ascii="Times New Roman" w:eastAsia="Times New Roman" w:hAnsi="Times New Roman" w:cs="Times New Roman"/>
+                <w:sz w:val="24"/>
+                <w:szCs w:val="24"/>
+                <w:lang w:val="en-US"/>
+              </w:rPr>
+              <w:t>= 'editor':</w:t>
+            </w:r>
+          </w:p>
+          <w:p>
+            <w:pPr>
+              <w:spacing w:line="360" w:lineRule="auto"/>
+              <w:rPr>
+                <w:rFonts w:ascii="Times New Roman" w:eastAsia="Times New Roman" w:hAnsi="Times New Roman" w:cs="Times New Roman"/>
+                <w:sz w:val="24"/>
+                <w:szCs w:val="24"/>
+                <w:lang w:val="en-US"/>
+              </w:rPr>
+            </w:pPr>
+            <w:r>
+              <w:rPr>
+                <w:rFonts w:ascii="Times New Roman" w:eastAsia="Times New Roman" w:hAnsi="Times New Roman" w:cs="Times New Roman"/>
+                <w:sz w:val="24"/>
+                <w:szCs w:val="24"/>
+                <w:lang w:val="en-US"/>
+              </w:rPr>
+              <w:t xml:space="preserve">            </w:t>
+            </w:r>
+            <w:proofErr w:type="spellStart"/>
+            <w:proofErr w:type="gramStart"/>
+            <w:r>
+              <w:rPr>
+                <w:rFonts w:ascii="Times New Roman" w:eastAsia="Times New Roman" w:hAnsi="Times New Roman" w:cs="Times New Roman"/>
+                <w:sz w:val="24"/>
+                <w:szCs w:val="24"/>
+                <w:lang w:val="en-US"/>
+              </w:rPr>
+              <w:t>player.upd</w:t>
+            </w:r>
+            <w:proofErr w:type="spellEnd"/>
+            <w:r>
+              <w:rPr>
+                <w:rFonts w:ascii="Times New Roman" w:eastAsia="Times New Roman" w:hAnsi="Times New Roman" w:cs="Times New Roman"/>
+                <w:sz w:val="24"/>
+                <w:szCs w:val="24"/>
+                <w:lang w:val="en-US"/>
+              </w:rPr>
+              <w:t>(</w:t>
+            </w:r>
+            <w:proofErr w:type="gramEnd"/>
+            <w:r>
+              <w:rPr>
+                <w:rFonts w:ascii="Times New Roman" w:eastAsia="Times New Roman" w:hAnsi="Times New Roman" w:cs="Times New Roman"/>
+                <w:sz w:val="24"/>
+                <w:szCs w:val="24"/>
+                <w:lang w:val="en-US"/>
+              </w:rPr>
+              <w:t>)</w:t>
+            </w:r>
+          </w:p>
+          <w:p>
+            <w:pPr>
+              <w:spacing w:line="360" w:lineRule="auto"/>
+              <w:rPr>
+                <w:rFonts w:ascii="Times New Roman" w:eastAsia="Times New Roman" w:hAnsi="Times New Roman" w:cs="Times New Roman"/>
+                <w:sz w:val="24"/>
+                <w:szCs w:val="24"/>
+                <w:lang w:val="en-US"/>
+              </w:rPr>
+            </w:pPr>
+            <w:r>
+              <w:rPr>
+                <w:rFonts w:ascii="Times New Roman" w:eastAsia="Times New Roman" w:hAnsi="Times New Roman" w:cs="Times New Roman"/>
+                <w:sz w:val="24"/>
+                <w:szCs w:val="24"/>
+                <w:lang w:val="en-US"/>
+              </w:rPr>
+              <w:t xml:space="preserve">        </w:t>
+            </w:r>
+          </w:p>
+          <w:p>
+            <w:pPr>
+              <w:spacing w:line="360" w:lineRule="auto"/>
+              <w:rPr>
+                <w:rFonts w:ascii="Times New Roman" w:eastAsia="Times New Roman" w:hAnsi="Times New Roman" w:cs="Times New Roman"/>
+                <w:sz w:val="24"/>
+                <w:szCs w:val="24"/>
+                <w:lang w:val="en-US"/>
+              </w:rPr>
+            </w:pPr>
+            <w:r>
+              <w:rPr>
+                <w:rFonts w:ascii="Times New Roman" w:eastAsia="Times New Roman" w:hAnsi="Times New Roman" w:cs="Times New Roman"/>
+                <w:sz w:val="24"/>
+                <w:szCs w:val="24"/>
+                <w:lang w:val="en-US"/>
+              </w:rPr>
+              <w:t xml:space="preserve">        </w:t>
+            </w:r>
+            <w:proofErr w:type="gramStart"/>
+            <w:r>
+              <w:rPr>
+                <w:rFonts w:ascii="Times New Roman" w:eastAsia="Times New Roman" w:hAnsi="Times New Roman" w:cs="Times New Roman"/>
+                <w:sz w:val="24"/>
+                <w:szCs w:val="24"/>
+                <w:lang w:val="en-US"/>
+              </w:rPr>
+              <w:t>update(</w:t>
+            </w:r>
+            <w:proofErr w:type="gramEnd"/>
+            <w:r>
+              <w:rPr>
+                <w:rFonts w:ascii="Times New Roman" w:eastAsia="Times New Roman" w:hAnsi="Times New Roman" w:cs="Times New Roman"/>
+                <w:sz w:val="24"/>
+                <w:szCs w:val="24"/>
+                <w:lang w:val="en-US"/>
+              </w:rPr>
+              <w:t>)</w:t>
+            </w:r>
+          </w:p>
+          <w:p>
+            <w:pPr>
+              <w:spacing w:line="360" w:lineRule="auto"/>
+              <w:rPr>
+                <w:rFonts w:ascii="Times New Roman" w:eastAsia="Times New Roman" w:hAnsi="Times New Roman" w:cs="Times New Roman"/>
+                <w:sz w:val="24"/>
+                <w:szCs w:val="24"/>
+                <w:lang w:val="en-US"/>
+              </w:rPr>
+            </w:pPr>
+            <w:r>
+              <w:rPr>
+                <w:rFonts w:ascii="Times New Roman" w:eastAsia="Times New Roman" w:hAnsi="Times New Roman" w:cs="Times New Roman"/>
+                <w:sz w:val="24"/>
+                <w:szCs w:val="24"/>
+                <w:lang w:val="en-US"/>
+              </w:rPr>
+              <w:t xml:space="preserve">        </w:t>
+            </w:r>
+          </w:p>
+          <w:p>
+            <w:pPr>
+              <w:spacing w:line="360" w:lineRule="auto"/>
+              <w:rPr>
+                <w:rFonts w:ascii="Times New Roman" w:eastAsia="Times New Roman" w:hAnsi="Times New Roman" w:cs="Times New Roman"/>
+                <w:sz w:val="24"/>
+                <w:szCs w:val="24"/>
+                <w:lang w:val="en-US"/>
+              </w:rPr>
+            </w:pPr>
+            <w:r>
+              <w:rPr>
+                <w:rFonts w:ascii="Times New Roman" w:eastAsia="Times New Roman" w:hAnsi="Times New Roman" w:cs="Times New Roman"/>
+                <w:sz w:val="24"/>
+                <w:szCs w:val="24"/>
+                <w:lang w:val="en-US"/>
+              </w:rPr>
+              <w:t xml:space="preserve">        for y in </w:t>
+            </w:r>
+            <w:proofErr w:type="gramStart"/>
+            <w:r>
+              <w:rPr>
+                <w:rFonts w:ascii="Times New Roman" w:eastAsia="Times New Roman" w:hAnsi="Times New Roman" w:cs="Times New Roman"/>
+                <w:sz w:val="24"/>
+                <w:szCs w:val="24"/>
+                <w:lang w:val="en-US"/>
+              </w:rPr>
+              <w:t>range(</w:t>
+            </w:r>
+            <w:proofErr w:type="gramEnd"/>
+            <w:r>
+              <w:rPr>
+                <w:rFonts w:ascii="Times New Roman" w:eastAsia="Times New Roman" w:hAnsi="Times New Roman" w:cs="Times New Roman"/>
+                <w:sz w:val="24"/>
+                <w:szCs w:val="24"/>
+                <w:lang w:val="en-US"/>
+              </w:rPr>
+              <w:t>16):</w:t>
+            </w:r>
+          </w:p>
+          <w:p>
+            <w:pPr>
+              <w:spacing w:line="360" w:lineRule="auto"/>
+              <w:rPr>
+                <w:rFonts w:ascii="Times New Roman" w:eastAsia="Times New Roman" w:hAnsi="Times New Roman" w:cs="Times New Roman"/>
+                <w:sz w:val="24"/>
+                <w:szCs w:val="24"/>
+                <w:lang w:val="en-US"/>
+              </w:rPr>
+            </w:pPr>
+            <w:r>
+              <w:rPr>
+                <w:rFonts w:ascii="Times New Roman" w:eastAsia="Times New Roman" w:hAnsi="Times New Roman" w:cs="Times New Roman"/>
+                <w:sz w:val="24"/>
+                <w:szCs w:val="24"/>
+                <w:lang w:val="en-US"/>
+              </w:rPr>
+              <w:lastRenderedPageBreak/>
+              <w:t xml:space="preserve">            for x in </w:t>
+            </w:r>
+            <w:proofErr w:type="gramStart"/>
+            <w:r>
+              <w:rPr>
+                <w:rFonts w:ascii="Times New Roman" w:eastAsia="Times New Roman" w:hAnsi="Times New Roman" w:cs="Times New Roman"/>
+                <w:sz w:val="24"/>
+                <w:szCs w:val="24"/>
+                <w:lang w:val="en-US"/>
+              </w:rPr>
+              <w:t>range(</w:t>
+            </w:r>
+            <w:proofErr w:type="gramEnd"/>
+            <w:r>
+              <w:rPr>
+                <w:rFonts w:ascii="Times New Roman" w:eastAsia="Times New Roman" w:hAnsi="Times New Roman" w:cs="Times New Roman"/>
+                <w:sz w:val="24"/>
+                <w:szCs w:val="24"/>
+                <w:lang w:val="en-US"/>
+              </w:rPr>
+              <w:t>16):</w:t>
+            </w:r>
+          </w:p>
+          <w:p>
+            <w:pPr>
+              <w:spacing w:line="360" w:lineRule="auto"/>
+              <w:rPr>
+                <w:rFonts w:ascii="Times New Roman" w:eastAsia="Times New Roman" w:hAnsi="Times New Roman" w:cs="Times New Roman"/>
+                <w:sz w:val="24"/>
+                <w:szCs w:val="24"/>
+                <w:lang w:val="en-US"/>
+              </w:rPr>
+            </w:pPr>
+            <w:r>
+              <w:rPr>
+                <w:rFonts w:ascii="Times New Roman" w:eastAsia="Times New Roman" w:hAnsi="Times New Roman" w:cs="Times New Roman"/>
+                <w:sz w:val="24"/>
+                <w:szCs w:val="24"/>
+                <w:lang w:val="en-US"/>
+              </w:rPr>
+              <w:t xml:space="preserve">                </w:t>
+            </w:r>
+            <w:proofErr w:type="spellStart"/>
+            <w:r>
+              <w:rPr>
+                <w:rFonts w:ascii="Times New Roman" w:eastAsia="Times New Roman" w:hAnsi="Times New Roman" w:cs="Times New Roman"/>
+                <w:sz w:val="24"/>
+                <w:szCs w:val="24"/>
+                <w:lang w:val="en-US"/>
+              </w:rPr>
+              <w:t>world_key</w:t>
+            </w:r>
+            <w:proofErr w:type="spellEnd"/>
+            <w:r>
+              <w:rPr>
+                <w:rFonts w:ascii="Times New Roman" w:eastAsia="Times New Roman" w:hAnsi="Times New Roman" w:cs="Times New Roman"/>
+                <w:sz w:val="24"/>
+                <w:szCs w:val="24"/>
+                <w:lang w:val="en-US"/>
+              </w:rPr>
+              <w:t xml:space="preserve"> = </w:t>
+            </w:r>
+            <w:proofErr w:type="spellStart"/>
+            <w:proofErr w:type="gramStart"/>
+            <w:r>
+              <w:rPr>
+                <w:rFonts w:ascii="Times New Roman" w:eastAsia="Times New Roman" w:hAnsi="Times New Roman" w:cs="Times New Roman"/>
+                <w:sz w:val="24"/>
+                <w:szCs w:val="24"/>
+                <w:lang w:val="en-US"/>
+              </w:rPr>
+              <w:t>world.get</w:t>
+            </w:r>
+            <w:proofErr w:type="spellEnd"/>
+            <w:r>
+              <w:rPr>
+                <w:rFonts w:ascii="Times New Roman" w:eastAsia="Times New Roman" w:hAnsi="Times New Roman" w:cs="Times New Roman"/>
+                <w:sz w:val="24"/>
+                <w:szCs w:val="24"/>
+                <w:lang w:val="en-US"/>
+              </w:rPr>
+              <w:t>(</w:t>
+            </w:r>
+            <w:proofErr w:type="gramEnd"/>
+            <w:r>
+              <w:rPr>
+                <w:rFonts w:ascii="Times New Roman" w:eastAsia="Times New Roman" w:hAnsi="Times New Roman" w:cs="Times New Roman"/>
+                <w:sz w:val="24"/>
+                <w:szCs w:val="24"/>
+                <w:lang w:val="en-US"/>
+              </w:rPr>
+              <w:t xml:space="preserve">str((x, y, 0))) or </w:t>
+            </w:r>
+            <w:proofErr w:type="spellStart"/>
+            <w:r>
+              <w:rPr>
+                <w:rFonts w:ascii="Times New Roman" w:eastAsia="Times New Roman" w:hAnsi="Times New Roman" w:cs="Times New Roman"/>
+                <w:sz w:val="24"/>
+                <w:szCs w:val="24"/>
+                <w:lang w:val="en-US"/>
+              </w:rPr>
+              <w:t>world.get</w:t>
+            </w:r>
+            <w:proofErr w:type="spellEnd"/>
+            <w:r>
+              <w:rPr>
+                <w:rFonts w:ascii="Times New Roman" w:eastAsia="Times New Roman" w:hAnsi="Times New Roman" w:cs="Times New Roman"/>
+                <w:sz w:val="24"/>
+                <w:szCs w:val="24"/>
+                <w:lang w:val="en-US"/>
+              </w:rPr>
+              <w:t>(str((x, y, 1))) or None</w:t>
+            </w:r>
+          </w:p>
+          <w:p>
+            <w:pPr>
+              <w:spacing w:line="360" w:lineRule="auto"/>
+              <w:rPr>
+                <w:rFonts w:ascii="Times New Roman" w:eastAsia="Times New Roman" w:hAnsi="Times New Roman" w:cs="Times New Roman"/>
+                <w:sz w:val="24"/>
+                <w:szCs w:val="24"/>
+                <w:lang w:val="en-US"/>
+              </w:rPr>
+            </w:pPr>
+            <w:r>
+              <w:rPr>
+                <w:rFonts w:ascii="Times New Roman" w:eastAsia="Times New Roman" w:hAnsi="Times New Roman" w:cs="Times New Roman"/>
+                <w:sz w:val="24"/>
+                <w:szCs w:val="24"/>
+                <w:lang w:val="en-US"/>
+              </w:rPr>
+              <w:t xml:space="preserve">                </w:t>
+            </w:r>
+          </w:p>
+          <w:p>
+            <w:pPr>
+              <w:spacing w:line="360" w:lineRule="auto"/>
+              <w:rPr>
+                <w:rFonts w:ascii="Times New Roman" w:eastAsia="Times New Roman" w:hAnsi="Times New Roman" w:cs="Times New Roman"/>
+                <w:sz w:val="24"/>
+                <w:szCs w:val="24"/>
+                <w:lang w:val="en-US"/>
+              </w:rPr>
+            </w:pPr>
+            <w:r>
+              <w:rPr>
+                <w:rFonts w:ascii="Times New Roman" w:eastAsia="Times New Roman" w:hAnsi="Times New Roman" w:cs="Times New Roman"/>
+                <w:sz w:val="24"/>
+                <w:szCs w:val="24"/>
+                <w:lang w:val="en-US"/>
+              </w:rPr>
+              <w:t xml:space="preserve">                if </w:t>
+            </w:r>
+            <w:proofErr w:type="spellStart"/>
+            <w:proofErr w:type="gramStart"/>
+            <w:r>
+              <w:rPr>
+                <w:rFonts w:ascii="Times New Roman" w:eastAsia="Times New Roman" w:hAnsi="Times New Roman" w:cs="Times New Roman"/>
+                <w:sz w:val="24"/>
+                <w:szCs w:val="24"/>
+                <w:lang w:val="en-US"/>
+              </w:rPr>
+              <w:t>player.pos</w:t>
+            </w:r>
+            <w:proofErr w:type="spellEnd"/>
+            <w:r>
+              <w:rPr>
+                <w:rFonts w:ascii="Times New Roman" w:eastAsia="Times New Roman" w:hAnsi="Times New Roman" w:cs="Times New Roman"/>
+                <w:sz w:val="24"/>
+                <w:szCs w:val="24"/>
+                <w:lang w:val="en-US"/>
+              </w:rPr>
+              <w:t>[</w:t>
+            </w:r>
+            <w:proofErr w:type="gramEnd"/>
+            <w:r>
+              <w:rPr>
+                <w:rFonts w:ascii="Times New Roman" w:eastAsia="Times New Roman" w:hAnsi="Times New Roman" w:cs="Times New Roman"/>
+                <w:sz w:val="24"/>
+                <w:szCs w:val="24"/>
+                <w:lang w:val="en-US"/>
+              </w:rPr>
+              <w:t xml:space="preserve">0] == x and </w:t>
+            </w:r>
+            <w:proofErr w:type="spellStart"/>
+            <w:r>
+              <w:rPr>
+                <w:rFonts w:ascii="Times New Roman" w:eastAsia="Times New Roman" w:hAnsi="Times New Roman" w:cs="Times New Roman"/>
+                <w:sz w:val="24"/>
+                <w:szCs w:val="24"/>
+                <w:lang w:val="en-US"/>
+              </w:rPr>
+              <w:t>player.pos</w:t>
+            </w:r>
+            <w:proofErr w:type="spellEnd"/>
+            <w:r>
+              <w:rPr>
+                <w:rFonts w:ascii="Times New Roman" w:eastAsia="Times New Roman" w:hAnsi="Times New Roman" w:cs="Times New Roman"/>
+                <w:sz w:val="24"/>
+                <w:szCs w:val="24"/>
+                <w:lang w:val="en-US"/>
+              </w:rPr>
+              <w:t>[1] == y:</w:t>
+            </w:r>
+          </w:p>
+          <w:p>
+            <w:pPr>
+              <w:spacing w:line="360" w:lineRule="auto"/>
+              <w:rPr>
+                <w:rFonts w:ascii="Times New Roman" w:eastAsia="Times New Roman" w:hAnsi="Times New Roman" w:cs="Times New Roman"/>
+                <w:sz w:val="24"/>
+                <w:szCs w:val="24"/>
+                <w:lang w:val="en-US"/>
+              </w:rPr>
+            </w:pPr>
+            <w:r>
+              <w:rPr>
+                <w:rFonts w:ascii="Times New Roman" w:eastAsia="Times New Roman" w:hAnsi="Times New Roman" w:cs="Times New Roman"/>
+                <w:sz w:val="24"/>
+                <w:szCs w:val="24"/>
+                <w:lang w:val="en-US"/>
+              </w:rPr>
+              <w:t xml:space="preserve">                    render += </w:t>
+            </w:r>
+            <w:proofErr w:type="gramStart"/>
+            <w:r>
+              <w:rPr>
+                <w:rFonts w:ascii="Times New Roman" w:eastAsia="Times New Roman" w:hAnsi="Times New Roman" w:cs="Times New Roman"/>
+                <w:sz w:val="24"/>
+                <w:szCs w:val="24"/>
+                <w:lang w:val="en-US"/>
+              </w:rPr>
+              <w:t>atlas[</w:t>
+            </w:r>
+            <w:proofErr w:type="gramEnd"/>
+            <w:r>
+              <w:rPr>
+                <w:rFonts w:ascii="Times New Roman" w:eastAsia="Times New Roman" w:hAnsi="Times New Roman" w:cs="Times New Roman"/>
+                <w:sz w:val="24"/>
+                <w:szCs w:val="24"/>
+                <w:lang w:val="en-US"/>
+              </w:rPr>
+              <w:t>0]</w:t>
+            </w:r>
+          </w:p>
+          <w:p>
+            <w:pPr>
+              <w:spacing w:line="360" w:lineRule="auto"/>
+              <w:rPr>
+                <w:rFonts w:ascii="Times New Roman" w:eastAsia="Times New Roman" w:hAnsi="Times New Roman" w:cs="Times New Roman"/>
+                <w:sz w:val="24"/>
+                <w:szCs w:val="24"/>
+                <w:lang w:val="en-US"/>
+              </w:rPr>
+            </w:pPr>
+            <w:r>
+              <w:rPr>
+                <w:rFonts w:ascii="Times New Roman" w:eastAsia="Times New Roman" w:hAnsi="Times New Roman" w:cs="Times New Roman"/>
+                <w:sz w:val="24"/>
+                <w:szCs w:val="24"/>
+                <w:lang w:val="en-US"/>
+              </w:rPr>
+              <w:t xml:space="preserve">                </w:t>
+            </w:r>
+            <w:proofErr w:type="spellStart"/>
+            <w:r>
+              <w:rPr>
+                <w:rFonts w:ascii="Times New Roman" w:eastAsia="Times New Roman" w:hAnsi="Times New Roman" w:cs="Times New Roman"/>
+                <w:sz w:val="24"/>
+                <w:szCs w:val="24"/>
+                <w:lang w:val="en-US"/>
+              </w:rPr>
+              <w:t>elif</w:t>
+            </w:r>
+            <w:proofErr w:type="spellEnd"/>
+            <w:r>
+              <w:rPr>
+                <w:rFonts w:ascii="Times New Roman" w:eastAsia="Times New Roman" w:hAnsi="Times New Roman" w:cs="Times New Roman"/>
+                <w:sz w:val="24"/>
+                <w:szCs w:val="24"/>
+                <w:lang w:val="en-US"/>
+              </w:rPr>
+              <w:t xml:space="preserve"> </w:t>
+            </w:r>
+            <w:proofErr w:type="spellStart"/>
+            <w:r>
+              <w:rPr>
+                <w:rFonts w:ascii="Times New Roman" w:eastAsia="Times New Roman" w:hAnsi="Times New Roman" w:cs="Times New Roman"/>
+                <w:sz w:val="24"/>
+                <w:szCs w:val="24"/>
+                <w:lang w:val="en-US"/>
+              </w:rPr>
+              <w:t>world_</w:t>
+            </w:r>
+            <w:proofErr w:type="gramStart"/>
+            <w:r>
+              <w:rPr>
+                <w:rFonts w:ascii="Times New Roman" w:eastAsia="Times New Roman" w:hAnsi="Times New Roman" w:cs="Times New Roman"/>
+                <w:sz w:val="24"/>
+                <w:szCs w:val="24"/>
+                <w:lang w:val="en-US"/>
+              </w:rPr>
+              <w:t>key</w:t>
+            </w:r>
+            <w:proofErr w:type="spellEnd"/>
+            <w:r>
+              <w:rPr>
+                <w:rFonts w:ascii="Times New Roman" w:eastAsia="Times New Roman" w:hAnsi="Times New Roman" w:cs="Times New Roman"/>
+                <w:sz w:val="24"/>
+                <w:szCs w:val="24"/>
+                <w:lang w:val="en-US"/>
+              </w:rPr>
+              <w:t xml:space="preserve"> !</w:t>
+            </w:r>
+            <w:proofErr w:type="gramEnd"/>
+            <w:r>
+              <w:rPr>
+                <w:rFonts w:ascii="Times New Roman" w:eastAsia="Times New Roman" w:hAnsi="Times New Roman" w:cs="Times New Roman"/>
+                <w:sz w:val="24"/>
+                <w:szCs w:val="24"/>
+                <w:lang w:val="en-US"/>
+              </w:rPr>
+              <w:t>= None:</w:t>
+            </w:r>
+          </w:p>
+          <w:p>
+            <w:pPr>
+              <w:spacing w:line="360" w:lineRule="auto"/>
+              <w:rPr>
+                <w:rFonts w:ascii="Times New Roman" w:eastAsia="Times New Roman" w:hAnsi="Times New Roman" w:cs="Times New Roman"/>
+                <w:sz w:val="24"/>
+                <w:szCs w:val="24"/>
+                <w:lang w:val="en-US"/>
+              </w:rPr>
+            </w:pPr>
+            <w:r>
+              <w:rPr>
+                <w:rFonts w:ascii="Times New Roman" w:eastAsia="Times New Roman" w:hAnsi="Times New Roman" w:cs="Times New Roman"/>
+                <w:sz w:val="24"/>
+                <w:szCs w:val="24"/>
+                <w:lang w:val="en-US"/>
+              </w:rPr>
+              <w:t xml:space="preserve">                    target = </w:t>
+            </w:r>
+            <w:proofErr w:type="spellStart"/>
+            <w:r>
+              <w:rPr>
+                <w:rFonts w:ascii="Times New Roman" w:eastAsia="Times New Roman" w:hAnsi="Times New Roman" w:cs="Times New Roman"/>
+                <w:sz w:val="24"/>
+                <w:szCs w:val="24"/>
+                <w:lang w:val="en-US"/>
+              </w:rPr>
+              <w:t>world_key</w:t>
+            </w:r>
+            <w:proofErr w:type="spellEnd"/>
+          </w:p>
+          <w:p>
+            <w:pPr>
+              <w:spacing w:line="360" w:lineRule="auto"/>
+              <w:rPr>
+                <w:rFonts w:ascii="Times New Roman" w:eastAsia="Times New Roman" w:hAnsi="Times New Roman" w:cs="Times New Roman"/>
+                <w:sz w:val="24"/>
+                <w:szCs w:val="24"/>
+                <w:lang w:val="en-US"/>
+              </w:rPr>
+            </w:pPr>
+            <w:r>
+              <w:rPr>
+                <w:rFonts w:ascii="Times New Roman" w:eastAsia="Times New Roman" w:hAnsi="Times New Roman" w:cs="Times New Roman"/>
+                <w:sz w:val="24"/>
+                <w:szCs w:val="24"/>
+                <w:lang w:val="en-US"/>
+              </w:rPr>
+              <w:t xml:space="preserve">                    if </w:t>
+            </w:r>
+            <w:proofErr w:type="spellStart"/>
+            <w:proofErr w:type="gramStart"/>
+            <w:r>
+              <w:rPr>
+                <w:rFonts w:ascii="Times New Roman" w:eastAsia="Times New Roman" w:hAnsi="Times New Roman" w:cs="Times New Roman"/>
+                <w:sz w:val="24"/>
+                <w:szCs w:val="24"/>
+                <w:lang w:val="en-US"/>
+              </w:rPr>
+              <w:t>target.get</w:t>
+            </w:r>
+            <w:proofErr w:type="spellEnd"/>
+            <w:r>
+              <w:rPr>
+                <w:rFonts w:ascii="Times New Roman" w:eastAsia="Times New Roman" w:hAnsi="Times New Roman" w:cs="Times New Roman"/>
+                <w:sz w:val="24"/>
+                <w:szCs w:val="24"/>
+                <w:lang w:val="en-US"/>
+              </w:rPr>
+              <w:t>(</w:t>
+            </w:r>
+            <w:proofErr w:type="gramEnd"/>
+            <w:r>
+              <w:rPr>
+                <w:rFonts w:ascii="Times New Roman" w:eastAsia="Times New Roman" w:hAnsi="Times New Roman" w:cs="Times New Roman"/>
+                <w:sz w:val="24"/>
+                <w:szCs w:val="24"/>
+                <w:lang w:val="en-US"/>
+              </w:rPr>
+              <w:t>'active', True):</w:t>
+            </w:r>
+          </w:p>
+          <w:p>
+            <w:pPr>
+              <w:spacing w:line="360" w:lineRule="auto"/>
+              <w:rPr>
+                <w:rFonts w:ascii="Times New Roman" w:eastAsia="Times New Roman" w:hAnsi="Times New Roman" w:cs="Times New Roman"/>
+                <w:sz w:val="24"/>
+                <w:szCs w:val="24"/>
+                <w:lang w:val="en-US"/>
+              </w:rPr>
+            </w:pPr>
+            <w:r>
+              <w:rPr>
+                <w:rFonts w:ascii="Times New Roman" w:eastAsia="Times New Roman" w:hAnsi="Times New Roman" w:cs="Times New Roman"/>
+                <w:sz w:val="24"/>
+                <w:szCs w:val="24"/>
+                <w:lang w:val="en-US"/>
+              </w:rPr>
+              <w:t xml:space="preserve">                        if type(target['sprite'][0]) == int:</w:t>
+            </w:r>
+          </w:p>
+          <w:p>
+            <w:pPr>
+              <w:spacing w:line="360" w:lineRule="auto"/>
+              <w:rPr>
+                <w:rFonts w:ascii="Times New Roman" w:eastAsia="Times New Roman" w:hAnsi="Times New Roman" w:cs="Times New Roman"/>
+                <w:sz w:val="24"/>
+                <w:szCs w:val="24"/>
+                <w:lang w:val="en-US"/>
+              </w:rPr>
+            </w:pPr>
+            <w:r>
+              <w:rPr>
+                <w:rFonts w:ascii="Times New Roman" w:eastAsia="Times New Roman" w:hAnsi="Times New Roman" w:cs="Times New Roman"/>
+                <w:sz w:val="24"/>
+                <w:szCs w:val="24"/>
+                <w:lang w:val="en-US"/>
+              </w:rPr>
+              <w:t xml:space="preserve">                            render += </w:t>
+            </w:r>
+            <w:proofErr w:type="spellStart"/>
+            <w:r>
+              <w:rPr>
+                <w:rFonts w:ascii="Times New Roman" w:eastAsia="Times New Roman" w:hAnsi="Times New Roman" w:cs="Times New Roman"/>
+                <w:sz w:val="24"/>
+                <w:szCs w:val="24"/>
+                <w:lang w:val="en-US"/>
+              </w:rPr>
+              <w:t>paint_str</w:t>
+            </w:r>
+            <w:proofErr w:type="spellEnd"/>
+            <w:r>
+              <w:rPr>
+                <w:rFonts w:ascii="Times New Roman" w:eastAsia="Times New Roman" w:hAnsi="Times New Roman" w:cs="Times New Roman"/>
+                <w:sz w:val="24"/>
+                <w:szCs w:val="24"/>
+                <w:lang w:val="en-US"/>
+              </w:rPr>
+              <w:t>(target['color'], atlas[target['sprite'][0]])</w:t>
+            </w:r>
+          </w:p>
+          <w:p>
+            <w:pPr>
+              <w:spacing w:line="360" w:lineRule="auto"/>
+              <w:rPr>
+                <w:rFonts w:ascii="Times New Roman" w:eastAsia="Times New Roman" w:hAnsi="Times New Roman" w:cs="Times New Roman"/>
+                <w:sz w:val="24"/>
+                <w:szCs w:val="24"/>
+                <w:lang w:val="en-US"/>
+              </w:rPr>
+            </w:pPr>
+            <w:r>
+              <w:rPr>
+                <w:rFonts w:ascii="Times New Roman" w:eastAsia="Times New Roman" w:hAnsi="Times New Roman" w:cs="Times New Roman"/>
+                <w:sz w:val="24"/>
+                <w:szCs w:val="24"/>
+                <w:lang w:val="en-US"/>
+              </w:rPr>
+              <w:t xml:space="preserve">                        else:</w:t>
+            </w:r>
+          </w:p>
+          <w:p>
+            <w:pPr>
+              <w:spacing w:line="360" w:lineRule="auto"/>
+              <w:rPr>
+                <w:rFonts w:ascii="Times New Roman" w:eastAsia="Times New Roman" w:hAnsi="Times New Roman" w:cs="Times New Roman"/>
+                <w:sz w:val="24"/>
+                <w:szCs w:val="24"/>
+                <w:lang w:val="en-US"/>
+              </w:rPr>
+            </w:pPr>
+            <w:r>
+              <w:rPr>
+                <w:rFonts w:ascii="Times New Roman" w:eastAsia="Times New Roman" w:hAnsi="Times New Roman" w:cs="Times New Roman"/>
+                <w:sz w:val="24"/>
+                <w:szCs w:val="24"/>
+                <w:lang w:val="en-US"/>
+              </w:rPr>
+              <w:t xml:space="preserve">                            render += </w:t>
+            </w:r>
+            <w:proofErr w:type="spellStart"/>
+            <w:r>
+              <w:rPr>
+                <w:rFonts w:ascii="Times New Roman" w:eastAsia="Times New Roman" w:hAnsi="Times New Roman" w:cs="Times New Roman"/>
+                <w:sz w:val="24"/>
+                <w:szCs w:val="24"/>
+                <w:lang w:val="en-US"/>
+              </w:rPr>
+              <w:t>paint_str</w:t>
+            </w:r>
+            <w:proofErr w:type="spellEnd"/>
+            <w:r>
+              <w:rPr>
+                <w:rFonts w:ascii="Times New Roman" w:eastAsia="Times New Roman" w:hAnsi="Times New Roman" w:cs="Times New Roman"/>
+                <w:sz w:val="24"/>
+                <w:szCs w:val="24"/>
+                <w:lang w:val="en-US"/>
+              </w:rPr>
+              <w:t>(target['color'], target['sprite'][0])</w:t>
+            </w:r>
+          </w:p>
+          <w:p>
+            <w:pPr>
+              <w:spacing w:line="360" w:lineRule="auto"/>
+              <w:rPr>
+                <w:rFonts w:ascii="Times New Roman" w:eastAsia="Times New Roman" w:hAnsi="Times New Roman" w:cs="Times New Roman"/>
+                <w:sz w:val="24"/>
+                <w:szCs w:val="24"/>
+                <w:lang w:val="en-US"/>
+              </w:rPr>
+            </w:pPr>
+            <w:r>
+              <w:rPr>
+                <w:rFonts w:ascii="Times New Roman" w:eastAsia="Times New Roman" w:hAnsi="Times New Roman" w:cs="Times New Roman"/>
+                <w:sz w:val="24"/>
+                <w:szCs w:val="24"/>
+                <w:lang w:val="en-US"/>
+              </w:rPr>
+              <w:t xml:space="preserve">                    else:</w:t>
+            </w:r>
+          </w:p>
+          <w:p>
+            <w:pPr>
+              <w:spacing w:line="360" w:lineRule="auto"/>
+              <w:rPr>
+                <w:rFonts w:ascii="Times New Roman" w:eastAsia="Times New Roman" w:hAnsi="Times New Roman" w:cs="Times New Roman"/>
+                <w:sz w:val="24"/>
+                <w:szCs w:val="24"/>
+                <w:lang w:val="en-US"/>
+              </w:rPr>
+            </w:pPr>
+            <w:r>
+              <w:rPr>
+                <w:rFonts w:ascii="Times New Roman" w:eastAsia="Times New Roman" w:hAnsi="Times New Roman" w:cs="Times New Roman"/>
+                <w:sz w:val="24"/>
+                <w:szCs w:val="24"/>
+                <w:lang w:val="en-US"/>
+              </w:rPr>
+              <w:t xml:space="preserve">                        if type(target['sprite'][1]) == int:</w:t>
+            </w:r>
+          </w:p>
+          <w:p>
+            <w:pPr>
+              <w:spacing w:line="360" w:lineRule="auto"/>
+              <w:rPr>
+                <w:rFonts w:ascii="Times New Roman" w:eastAsia="Times New Roman" w:hAnsi="Times New Roman" w:cs="Times New Roman"/>
+                <w:sz w:val="24"/>
+                <w:szCs w:val="24"/>
+                <w:lang w:val="en-US"/>
+              </w:rPr>
+            </w:pPr>
+            <w:r>
+              <w:rPr>
+                <w:rFonts w:ascii="Times New Roman" w:eastAsia="Times New Roman" w:hAnsi="Times New Roman" w:cs="Times New Roman"/>
+                <w:sz w:val="24"/>
+                <w:szCs w:val="24"/>
+                <w:lang w:val="en-US"/>
+              </w:rPr>
+              <w:t xml:space="preserve">                            render += </w:t>
+            </w:r>
+            <w:proofErr w:type="spellStart"/>
+            <w:r>
+              <w:rPr>
+                <w:rFonts w:ascii="Times New Roman" w:eastAsia="Times New Roman" w:hAnsi="Times New Roman" w:cs="Times New Roman"/>
+                <w:sz w:val="24"/>
+                <w:szCs w:val="24"/>
+                <w:lang w:val="en-US"/>
+              </w:rPr>
+              <w:t>paint_str</w:t>
+            </w:r>
+            <w:proofErr w:type="spellEnd"/>
+            <w:r>
+              <w:rPr>
+                <w:rFonts w:ascii="Times New Roman" w:eastAsia="Times New Roman" w:hAnsi="Times New Roman" w:cs="Times New Roman"/>
+                <w:sz w:val="24"/>
+                <w:szCs w:val="24"/>
+                <w:lang w:val="en-US"/>
+              </w:rPr>
+              <w:t>(target['color'], atlas[target['sprite'][1]])</w:t>
+            </w:r>
+          </w:p>
+          <w:p>
+            <w:pPr>
+              <w:spacing w:line="360" w:lineRule="auto"/>
+              <w:rPr>
+                <w:rFonts w:ascii="Times New Roman" w:eastAsia="Times New Roman" w:hAnsi="Times New Roman" w:cs="Times New Roman"/>
+                <w:sz w:val="24"/>
+                <w:szCs w:val="24"/>
+                <w:lang w:val="en-US"/>
+              </w:rPr>
+            </w:pPr>
+            <w:r>
+              <w:rPr>
+                <w:rFonts w:ascii="Times New Roman" w:eastAsia="Times New Roman" w:hAnsi="Times New Roman" w:cs="Times New Roman"/>
+                <w:sz w:val="24"/>
+                <w:szCs w:val="24"/>
+                <w:lang w:val="en-US"/>
+              </w:rPr>
+              <w:t xml:space="preserve">                        else:</w:t>
+            </w:r>
+          </w:p>
+          <w:p>
+            <w:pPr>
+              <w:spacing w:line="360" w:lineRule="auto"/>
+              <w:rPr>
+                <w:rFonts w:ascii="Times New Roman" w:eastAsia="Times New Roman" w:hAnsi="Times New Roman" w:cs="Times New Roman"/>
+                <w:sz w:val="24"/>
+                <w:szCs w:val="24"/>
+                <w:lang w:val="en-US"/>
+              </w:rPr>
+            </w:pPr>
+            <w:r>
+              <w:rPr>
+                <w:rFonts w:ascii="Times New Roman" w:eastAsia="Times New Roman" w:hAnsi="Times New Roman" w:cs="Times New Roman"/>
+                <w:sz w:val="24"/>
+                <w:szCs w:val="24"/>
+                <w:lang w:val="en-US"/>
+              </w:rPr>
+              <w:t xml:space="preserve">                            render += </w:t>
+            </w:r>
+            <w:proofErr w:type="spellStart"/>
+            <w:r>
+              <w:rPr>
+                <w:rFonts w:ascii="Times New Roman" w:eastAsia="Times New Roman" w:hAnsi="Times New Roman" w:cs="Times New Roman"/>
+                <w:sz w:val="24"/>
+                <w:szCs w:val="24"/>
+                <w:lang w:val="en-US"/>
+              </w:rPr>
+              <w:t>paint_str</w:t>
+            </w:r>
+            <w:proofErr w:type="spellEnd"/>
+            <w:r>
+              <w:rPr>
+                <w:rFonts w:ascii="Times New Roman" w:eastAsia="Times New Roman" w:hAnsi="Times New Roman" w:cs="Times New Roman"/>
+                <w:sz w:val="24"/>
+                <w:szCs w:val="24"/>
+                <w:lang w:val="en-US"/>
+              </w:rPr>
+              <w:t>(target['color'], target['sprite'][1])</w:t>
+            </w:r>
+          </w:p>
+          <w:p>
+            <w:pPr>
+              <w:spacing w:line="360" w:lineRule="auto"/>
+              <w:rPr>
+                <w:rFonts w:ascii="Times New Roman" w:eastAsia="Times New Roman" w:hAnsi="Times New Roman" w:cs="Times New Roman"/>
+                <w:sz w:val="24"/>
+                <w:szCs w:val="24"/>
+                <w:lang w:val="en-US"/>
+              </w:rPr>
+            </w:pPr>
+            <w:r>
+              <w:rPr>
+                <w:rFonts w:ascii="Times New Roman" w:eastAsia="Times New Roman" w:hAnsi="Times New Roman" w:cs="Times New Roman"/>
+                <w:sz w:val="24"/>
+                <w:szCs w:val="24"/>
+                <w:lang w:val="en-US"/>
+              </w:rPr>
+              <w:t xml:space="preserve">                else:</w:t>
+            </w:r>
+          </w:p>
+          <w:p>
+            <w:pPr>
+              <w:spacing w:line="360" w:lineRule="auto"/>
+              <w:rPr>
+                <w:rFonts w:ascii="Times New Roman" w:eastAsia="Times New Roman" w:hAnsi="Times New Roman" w:cs="Times New Roman"/>
+                <w:sz w:val="24"/>
+                <w:szCs w:val="24"/>
+                <w:lang w:val="en-US"/>
+              </w:rPr>
+            </w:pPr>
+            <w:r>
+              <w:rPr>
+                <w:rFonts w:ascii="Times New Roman" w:eastAsia="Times New Roman" w:hAnsi="Times New Roman" w:cs="Times New Roman"/>
+                <w:sz w:val="24"/>
+                <w:szCs w:val="24"/>
+                <w:lang w:val="en-US"/>
+              </w:rPr>
+              <w:t xml:space="preserve">                    render += '.'</w:t>
+            </w:r>
+          </w:p>
+          <w:p>
+            <w:pPr>
+              <w:spacing w:line="360" w:lineRule="auto"/>
+              <w:rPr>
+                <w:rFonts w:ascii="Times New Roman" w:eastAsia="Times New Roman" w:hAnsi="Times New Roman" w:cs="Times New Roman"/>
+                <w:sz w:val="24"/>
+                <w:szCs w:val="24"/>
+                <w:lang w:val="en-US"/>
+              </w:rPr>
+            </w:pPr>
+            <w:r>
+              <w:rPr>
+                <w:rFonts w:ascii="Times New Roman" w:eastAsia="Times New Roman" w:hAnsi="Times New Roman" w:cs="Times New Roman"/>
+                <w:sz w:val="24"/>
+                <w:szCs w:val="24"/>
+                <w:lang w:val="en-US"/>
+              </w:rPr>
+              <w:t xml:space="preserve">                render += ' '</w:t>
+            </w:r>
+          </w:p>
+          <w:p>
+            <w:pPr>
+              <w:spacing w:line="360" w:lineRule="auto"/>
+              <w:rPr>
+                <w:rFonts w:ascii="Times New Roman" w:eastAsia="Times New Roman" w:hAnsi="Times New Roman" w:cs="Times New Roman"/>
+                <w:sz w:val="24"/>
+                <w:szCs w:val="24"/>
+              </w:rPr>
+            </w:pPr>
+            <w:r>
+              <w:rPr>
+                <w:rFonts w:ascii="Times New Roman" w:eastAsia="Times New Roman" w:hAnsi="Times New Roman" w:cs="Times New Roman"/>
+                <w:sz w:val="24"/>
+                <w:szCs w:val="24"/>
+                <w:lang w:val="en-US"/>
+              </w:rPr>
+              <w:t xml:space="preserve">            </w:t>
+            </w:r>
+            <w:proofErr w:type="spellStart"/>
+            <w:r>
+              <w:rPr>
+                <w:rFonts w:ascii="Times New Roman" w:eastAsia="Times New Roman" w:hAnsi="Times New Roman" w:cs="Times New Roman"/>
+                <w:sz w:val="24"/>
+                <w:szCs w:val="24"/>
+              </w:rPr>
+              <w:t>render</w:t>
+            </w:r>
+            <w:proofErr w:type="spellEnd"/>
+            <w:r>
+              <w:rPr>
+                <w:rFonts w:ascii="Times New Roman" w:eastAsia="Times New Roman" w:hAnsi="Times New Roman" w:cs="Times New Roman"/>
+                <w:sz w:val="24"/>
+                <w:szCs w:val="24"/>
+              </w:rPr>
+              <w:t xml:space="preserve"> += '\n'</w:t>
+            </w:r>
+          </w:p>
+          <w:p>
+            <w:pPr>
+              <w:spacing w:line="360" w:lineRule="auto"/>
+              <w:rPr>
+                <w:rFonts w:ascii="Times New Roman" w:eastAsia="Times New Roman" w:hAnsi="Times New Roman" w:cs="Times New Roman"/>
+                <w:sz w:val="24"/>
+                <w:szCs w:val="24"/>
+              </w:rPr>
+            </w:pPr>
+            <w:r>
+              <w:rPr>
+                <w:rFonts w:ascii="Times New Roman" w:eastAsia="Times New Roman" w:hAnsi="Times New Roman" w:cs="Times New Roman"/>
+                <w:sz w:val="24"/>
+                <w:szCs w:val="24"/>
+              </w:rPr>
+              <w:t xml:space="preserve">            </w:t>
+            </w:r>
+          </w:p>
+          <w:p>
+            <w:pPr>
+              <w:spacing w:line="360" w:lineRule="auto"/>
+              <w:rPr>
+                <w:rFonts w:ascii="Times New Roman" w:eastAsia="Times New Roman" w:hAnsi="Times New Roman" w:cs="Times New Roman"/>
+                <w:sz w:val="24"/>
+                <w:szCs w:val="24"/>
+                <w:lang w:val="en-US"/>
+              </w:rPr>
+            </w:pPr>
+            <w:r>
+              <w:rPr>
+                <w:rFonts w:ascii="Times New Roman" w:eastAsia="Times New Roman" w:hAnsi="Times New Roman" w:cs="Times New Roman"/>
+                <w:sz w:val="24"/>
+                <w:szCs w:val="24"/>
+              </w:rPr>
+              <w:lastRenderedPageBreak/>
+              <w:t xml:space="preserve">        </w:t>
+            </w:r>
+            <w:r>
+              <w:rPr>
+                <w:rFonts w:ascii="Times New Roman" w:eastAsia="Times New Roman" w:hAnsi="Times New Roman" w:cs="Times New Roman"/>
+                <w:sz w:val="24"/>
+                <w:szCs w:val="24"/>
+                <w:lang w:val="en-US"/>
+              </w:rPr>
+              <w:t>if mode == 'editor':</w:t>
+            </w:r>
+          </w:p>
+          <w:p>
+            <w:pPr>
+              <w:spacing w:line="360" w:lineRule="auto"/>
+              <w:rPr>
+                <w:rFonts w:ascii="Times New Roman" w:eastAsia="Times New Roman" w:hAnsi="Times New Roman" w:cs="Times New Roman"/>
+                <w:sz w:val="24"/>
+                <w:szCs w:val="24"/>
+                <w:lang w:val="en-US"/>
+              </w:rPr>
+            </w:pPr>
+            <w:r>
+              <w:rPr>
+                <w:rFonts w:ascii="Times New Roman" w:eastAsia="Times New Roman" w:hAnsi="Times New Roman" w:cs="Times New Roman"/>
+                <w:sz w:val="24"/>
+                <w:szCs w:val="24"/>
+                <w:lang w:val="en-US"/>
+              </w:rPr>
+              <w:t xml:space="preserve">            render += f"\</w:t>
+            </w:r>
+            <w:proofErr w:type="gramStart"/>
+            <w:r>
+              <w:rPr>
+                <w:rFonts w:ascii="Times New Roman" w:eastAsia="Times New Roman" w:hAnsi="Times New Roman" w:cs="Times New Roman"/>
+                <w:sz w:val="24"/>
+                <w:szCs w:val="24"/>
+                <w:lang w:val="en-US"/>
+              </w:rPr>
+              <w:t>n[</w:t>
+            </w:r>
+            <w:proofErr w:type="gramEnd"/>
+            <w:r>
+              <w:rPr>
+                <w:rFonts w:ascii="Times New Roman" w:eastAsia="Times New Roman" w:hAnsi="Times New Roman" w:cs="Times New Roman"/>
+                <w:sz w:val="24"/>
+                <w:szCs w:val="24"/>
+                <w:lang w:val="en-US"/>
+              </w:rPr>
+              <w:t xml:space="preserve"> </w:t>
+            </w:r>
+            <w:r>
+              <w:rPr>
+                <w:rFonts w:ascii="Times New Roman" w:eastAsia="Times New Roman" w:hAnsi="Times New Roman" w:cs="Times New Roman"/>
+                <w:sz w:val="24"/>
+                <w:szCs w:val="24"/>
+              </w:rPr>
+              <w:t>РЕДАКТОР</w:t>
+            </w:r>
+            <w:r>
+              <w:rPr>
+                <w:rFonts w:ascii="Times New Roman" w:eastAsia="Times New Roman" w:hAnsi="Times New Roman" w:cs="Times New Roman"/>
+                <w:sz w:val="24"/>
+                <w:szCs w:val="24"/>
+                <w:lang w:val="en-US"/>
+              </w:rPr>
+              <w:t xml:space="preserve"> ] X:{player.pos[0]} Y:{player.pos[1]} </w:t>
+            </w:r>
+            <w:proofErr w:type="spellStart"/>
+            <w:r>
+              <w:rPr>
+                <w:rFonts w:ascii="Times New Roman" w:eastAsia="Times New Roman" w:hAnsi="Times New Roman" w:cs="Times New Roman"/>
+                <w:sz w:val="24"/>
+                <w:szCs w:val="24"/>
+                <w:lang w:val="en-US"/>
+              </w:rPr>
+              <w:t>Sel_L</w:t>
+            </w:r>
+            <w:proofErr w:type="spellEnd"/>
+            <w:r>
+              <w:rPr>
+                <w:rFonts w:ascii="Times New Roman" w:eastAsia="Times New Roman" w:hAnsi="Times New Roman" w:cs="Times New Roman"/>
+                <w:sz w:val="24"/>
+                <w:szCs w:val="24"/>
+                <w:lang w:val="en-US"/>
+              </w:rPr>
+              <w:t>:{sell}\n"</w:t>
+            </w:r>
+          </w:p>
+          <w:p>
+            <w:pPr>
+              <w:spacing w:line="360" w:lineRule="auto"/>
+              <w:rPr>
+                <w:rFonts w:ascii="Times New Roman" w:eastAsia="Times New Roman" w:hAnsi="Times New Roman" w:cs="Times New Roman"/>
+                <w:sz w:val="24"/>
+                <w:szCs w:val="24"/>
+                <w:lang w:val="en-US"/>
+              </w:rPr>
+            </w:pPr>
+            <w:r>
+              <w:rPr>
+                <w:rFonts w:ascii="Times New Roman" w:eastAsia="Times New Roman" w:hAnsi="Times New Roman" w:cs="Times New Roman"/>
+                <w:sz w:val="24"/>
+                <w:szCs w:val="24"/>
+                <w:lang w:val="en-US"/>
+              </w:rPr>
+              <w:t xml:space="preserve">            render += f"\</w:t>
+            </w:r>
+            <w:proofErr w:type="spellStart"/>
+            <w:r>
+              <w:rPr>
+                <w:rFonts w:ascii="Times New Roman" w:eastAsia="Times New Roman" w:hAnsi="Times New Roman" w:cs="Times New Roman"/>
+                <w:sz w:val="24"/>
+                <w:szCs w:val="24"/>
+                <w:lang w:val="en-US"/>
+              </w:rPr>
+              <w:t>nStanding</w:t>
+            </w:r>
+            <w:proofErr w:type="spellEnd"/>
+            <w:r>
+              <w:rPr>
+                <w:rFonts w:ascii="Times New Roman" w:eastAsia="Times New Roman" w:hAnsi="Times New Roman" w:cs="Times New Roman"/>
+                <w:sz w:val="24"/>
+                <w:szCs w:val="24"/>
+                <w:lang w:val="en-US"/>
+              </w:rPr>
+              <w:t xml:space="preserve"> on: {</w:t>
+            </w:r>
+            <w:proofErr w:type="spellStart"/>
+            <w:r>
+              <w:rPr>
+                <w:rFonts w:ascii="Times New Roman" w:eastAsia="Times New Roman" w:hAnsi="Times New Roman" w:cs="Times New Roman"/>
+                <w:sz w:val="24"/>
+                <w:szCs w:val="24"/>
+                <w:lang w:val="en-US"/>
+              </w:rPr>
+              <w:t>world.get</w:t>
+            </w:r>
+            <w:proofErr w:type="spellEnd"/>
+            <w:r>
+              <w:rPr>
+                <w:rFonts w:ascii="Times New Roman" w:eastAsia="Times New Roman" w:hAnsi="Times New Roman" w:cs="Times New Roman"/>
+                <w:sz w:val="24"/>
+                <w:szCs w:val="24"/>
+                <w:lang w:val="en-US"/>
+              </w:rPr>
+              <w:t>(str((</w:t>
+            </w:r>
+            <w:proofErr w:type="spellStart"/>
+            <w:proofErr w:type="gramStart"/>
+            <w:r>
+              <w:rPr>
+                <w:rFonts w:ascii="Times New Roman" w:eastAsia="Times New Roman" w:hAnsi="Times New Roman" w:cs="Times New Roman"/>
+                <w:sz w:val="24"/>
+                <w:szCs w:val="24"/>
+                <w:lang w:val="en-US"/>
+              </w:rPr>
+              <w:t>player.pos</w:t>
+            </w:r>
+            <w:proofErr w:type="spellEnd"/>
+            <w:r>
+              <w:rPr>
+                <w:rFonts w:ascii="Times New Roman" w:eastAsia="Times New Roman" w:hAnsi="Times New Roman" w:cs="Times New Roman"/>
+                <w:sz w:val="24"/>
+                <w:szCs w:val="24"/>
+                <w:lang w:val="en-US"/>
+              </w:rPr>
+              <w:t>[</w:t>
+            </w:r>
+            <w:proofErr w:type="gramEnd"/>
+            <w:r>
+              <w:rPr>
+                <w:rFonts w:ascii="Times New Roman" w:eastAsia="Times New Roman" w:hAnsi="Times New Roman" w:cs="Times New Roman"/>
+                <w:sz w:val="24"/>
+                <w:szCs w:val="24"/>
+                <w:lang w:val="en-US"/>
+              </w:rPr>
+              <w:t xml:space="preserve">0], </w:t>
+            </w:r>
+            <w:proofErr w:type="spellStart"/>
+            <w:r>
+              <w:rPr>
+                <w:rFonts w:ascii="Times New Roman" w:eastAsia="Times New Roman" w:hAnsi="Times New Roman" w:cs="Times New Roman"/>
+                <w:sz w:val="24"/>
+                <w:szCs w:val="24"/>
+                <w:lang w:val="en-US"/>
+              </w:rPr>
+              <w:t>player.pos</w:t>
+            </w:r>
+            <w:proofErr w:type="spellEnd"/>
+            <w:r>
+              <w:rPr>
+                <w:rFonts w:ascii="Times New Roman" w:eastAsia="Times New Roman" w:hAnsi="Times New Roman" w:cs="Times New Roman"/>
+                <w:sz w:val="24"/>
+                <w:szCs w:val="24"/>
+                <w:lang w:val="en-US"/>
+              </w:rPr>
+              <w:t>[1], sell))) or 'Nothing'}"</w:t>
+            </w:r>
+          </w:p>
+          <w:p>
+            <w:pPr>
+              <w:spacing w:line="360" w:lineRule="auto"/>
+              <w:rPr>
+                <w:rFonts w:ascii="Times New Roman" w:eastAsia="Times New Roman" w:hAnsi="Times New Roman" w:cs="Times New Roman"/>
+                <w:sz w:val="24"/>
+                <w:szCs w:val="24"/>
+                <w:lang w:val="en-US"/>
+              </w:rPr>
+            </w:pPr>
+            <w:r>
+              <w:rPr>
+                <w:rFonts w:ascii="Times New Roman" w:eastAsia="Times New Roman" w:hAnsi="Times New Roman" w:cs="Times New Roman"/>
+                <w:sz w:val="24"/>
+                <w:szCs w:val="24"/>
+                <w:lang w:val="en-US"/>
+              </w:rPr>
+              <w:t xml:space="preserve">            render += f"\</w:t>
+            </w:r>
+            <w:proofErr w:type="spellStart"/>
+            <w:r>
+              <w:rPr>
+                <w:rFonts w:ascii="Times New Roman" w:eastAsia="Times New Roman" w:hAnsi="Times New Roman" w:cs="Times New Roman"/>
+                <w:sz w:val="24"/>
+                <w:szCs w:val="24"/>
+                <w:lang w:val="en-US"/>
+              </w:rPr>
+              <w:t>nSelected</w:t>
+            </w:r>
+            <w:proofErr w:type="spellEnd"/>
+            <w:r>
+              <w:rPr>
+                <w:rFonts w:ascii="Times New Roman" w:eastAsia="Times New Roman" w:hAnsi="Times New Roman" w:cs="Times New Roman"/>
+                <w:sz w:val="24"/>
+                <w:szCs w:val="24"/>
+                <w:lang w:val="en-US"/>
+              </w:rPr>
+              <w:t>: {</w:t>
+            </w:r>
+            <w:proofErr w:type="spellStart"/>
+            <w:r>
+              <w:rPr>
+                <w:rFonts w:ascii="Times New Roman" w:eastAsia="Times New Roman" w:hAnsi="Times New Roman" w:cs="Times New Roman"/>
+                <w:sz w:val="24"/>
+                <w:szCs w:val="24"/>
+                <w:lang w:val="en-US"/>
+              </w:rPr>
+              <w:t>sel</w:t>
+            </w:r>
+            <w:proofErr w:type="spellEnd"/>
+            <w:r>
+              <w:rPr>
+                <w:rFonts w:ascii="Times New Roman" w:eastAsia="Times New Roman" w:hAnsi="Times New Roman" w:cs="Times New Roman"/>
+                <w:sz w:val="24"/>
+                <w:szCs w:val="24"/>
+                <w:lang w:val="en-US"/>
+              </w:rPr>
+              <w:t>}"</w:t>
+            </w:r>
+          </w:p>
+          <w:p>
+            <w:pPr>
+              <w:spacing w:line="360" w:lineRule="auto"/>
+              <w:rPr>
+                <w:rFonts w:ascii="Times New Roman" w:eastAsia="Times New Roman" w:hAnsi="Times New Roman" w:cs="Times New Roman"/>
+                <w:sz w:val="24"/>
+                <w:szCs w:val="24"/>
+                <w:lang w:val="en-US"/>
+              </w:rPr>
+            </w:pPr>
+            <w:r>
+              <w:rPr>
+                <w:rFonts w:ascii="Times New Roman" w:eastAsia="Times New Roman" w:hAnsi="Times New Roman" w:cs="Times New Roman"/>
+                <w:sz w:val="24"/>
+                <w:szCs w:val="24"/>
+                <w:lang w:val="en-US"/>
+              </w:rPr>
+              <w:t xml:space="preserve">            </w:t>
+            </w:r>
+          </w:p>
+          <w:p>
+            <w:pPr>
+              <w:spacing w:line="360" w:lineRule="auto"/>
+              <w:rPr>
+                <w:rFonts w:ascii="Times New Roman" w:eastAsia="Times New Roman" w:hAnsi="Times New Roman" w:cs="Times New Roman"/>
+                <w:sz w:val="24"/>
+                <w:szCs w:val="24"/>
+                <w:lang w:val="en-US"/>
+              </w:rPr>
+            </w:pPr>
+            <w:r>
+              <w:rPr>
+                <w:rFonts w:ascii="Times New Roman" w:eastAsia="Times New Roman" w:hAnsi="Times New Roman" w:cs="Times New Roman"/>
+                <w:sz w:val="24"/>
+                <w:szCs w:val="24"/>
+                <w:lang w:val="en-US"/>
+              </w:rPr>
+              <w:t xml:space="preserve">        print(render)</w:t>
+            </w:r>
+          </w:p>
+          <w:p>
+            <w:pPr>
+              <w:spacing w:line="360" w:lineRule="auto"/>
+              <w:rPr>
+                <w:rFonts w:ascii="Times New Roman" w:eastAsia="Times New Roman" w:hAnsi="Times New Roman" w:cs="Times New Roman"/>
+                <w:sz w:val="24"/>
+                <w:szCs w:val="24"/>
+              </w:rPr>
+            </w:pPr>
+            <w:r>
+              <w:rPr>
+                <w:rFonts w:ascii="Times New Roman" w:eastAsia="Times New Roman" w:hAnsi="Times New Roman" w:cs="Times New Roman"/>
+                <w:sz w:val="24"/>
+                <w:szCs w:val="24"/>
+                <w:lang w:val="en-US"/>
+              </w:rPr>
+              <w:t xml:space="preserve">        </w:t>
+            </w:r>
+            <w:proofErr w:type="spellStart"/>
+            <w:proofErr w:type="gramStart"/>
+            <w:r>
+              <w:rPr>
+                <w:rFonts w:ascii="Times New Roman" w:eastAsia="Times New Roman" w:hAnsi="Times New Roman" w:cs="Times New Roman"/>
+                <w:sz w:val="24"/>
+                <w:szCs w:val="24"/>
+              </w:rPr>
+              <w:t>time.sleep</w:t>
+            </w:r>
+            <w:proofErr w:type="spellEnd"/>
+            <w:proofErr w:type="gramEnd"/>
+            <w:r>
+              <w:rPr>
+                <w:rFonts w:ascii="Times New Roman" w:eastAsia="Times New Roman" w:hAnsi="Times New Roman" w:cs="Times New Roman"/>
+                <w:sz w:val="24"/>
+                <w:szCs w:val="24"/>
+              </w:rPr>
+              <w:t>(0.03)</w:t>
             </w:r>
           </w:p>
         </w:tc>
@@ -1186,6 +2967,7 @@
                 <w:sz w:val="24"/>
                 <w:szCs w:val="24"/>
               </w:rPr>
+              <w:lastRenderedPageBreak/>
               <w:t>Тестовые примеры (различные режимы функционирования программы – копии экрана)</w:t>
             </w:r>
           </w:p>
@@ -1199,7 +2981,6 @@
               <w:spacing w:line="360" w:lineRule="auto"/>
               <w:rPr>
                 <w:rFonts w:ascii="Times New Roman" w:eastAsia="Times New Roman" w:hAnsi="Times New Roman" w:cs="Times New Roman"/>
-                <w:color w:val="385623" w:themeColor="accent6" w:themeShade="80"/>
                 <w:sz w:val="24"/>
                 <w:szCs w:val="24"/>
               </w:rPr>
@@ -1225,7 +3006,6 @@
                 <w:rFonts w:ascii="Times New Roman" w:eastAsia="Times New Roman" w:hAnsi="Times New Roman" w:cs="Times New Roman"/>
                 <w:sz w:val="24"/>
                 <w:szCs w:val="24"/>
-                <w:lang w:val="en-US"/>
               </w:rPr>
               <w:t>:</w:t>
             </w:r>
@@ -1243,69 +3023,61 @@
                 <w:color w:val="385623" w:themeColor="accent6" w:themeShade="80"/>
                 <w:sz w:val="24"/>
                 <w:szCs w:val="24"/>
-                <w:lang w:val="en-US"/>
-              </w:rPr>
-              <w:t>ConGame</w:t>
-            </w:r>
-          </w:p>
-          <w:p>
-            <w:pPr>
-              <w:spacing w:line="360" w:lineRule="auto"/>
-              <w:rPr>
-                <w:rFonts w:ascii="Times New Roman" w:eastAsia="Times New Roman" w:hAnsi="Times New Roman" w:cs="Times New Roman"/>
-                <w:color w:val="385623" w:themeColor="accent6" w:themeShade="80"/>
-                <w:sz w:val="24"/>
-                <w:szCs w:val="24"/>
-              </w:rPr>
-            </w:pPr>
-            <w:r>
-              <w:rPr>
-                <w:rFonts w:ascii="Times New Roman" w:eastAsia="Times New Roman" w:hAnsi="Times New Roman" w:cs="Times New Roman"/>
-                <w:color w:val="385623" w:themeColor="accent6" w:themeShade="80"/>
-                <w:sz w:val="24"/>
-                <w:szCs w:val="24"/>
-              </w:rPr>
-              <w:t>Альфа версия</w:t>
-            </w:r>
-          </w:p>
-          <w:p>
-            <w:pPr>
-              <w:spacing w:line="360" w:lineRule="auto"/>
-              <w:rPr>
-                <w:rFonts w:ascii="Times New Roman" w:eastAsia="Times New Roman" w:hAnsi="Times New Roman" w:cs="Times New Roman"/>
-                <w:color w:val="385623" w:themeColor="accent6" w:themeShade="80"/>
-                <w:sz w:val="24"/>
-                <w:szCs w:val="24"/>
-              </w:rPr>
-            </w:pPr>
-            <w:r>
-              <w:rPr>
-                <w:rFonts w:ascii="Times New Roman" w:eastAsia="Times New Roman" w:hAnsi="Times New Roman" w:cs="Times New Roman"/>
-                <w:color w:val="385623" w:themeColor="accent6" w:themeShade="80"/>
-                <w:sz w:val="24"/>
-                <w:szCs w:val="24"/>
-              </w:rPr>
-              <w:t xml:space="preserve"> Играть&lt;</w:t>
-            </w:r>
-          </w:p>
-          <w:p>
-            <w:pPr>
-              <w:spacing w:line="360" w:lineRule="auto"/>
-              <w:rPr>
-                <w:rFonts w:ascii="Times New Roman" w:eastAsia="Times New Roman" w:hAnsi="Times New Roman" w:cs="Times New Roman"/>
-                <w:color w:val="385623" w:themeColor="accent6" w:themeShade="80"/>
-                <w:sz w:val="24"/>
-                <w:szCs w:val="24"/>
-              </w:rPr>
-            </w:pPr>
-            <w:r>
-              <w:rPr>
-                <w:rFonts w:ascii="Times New Roman" w:eastAsia="Times New Roman" w:hAnsi="Times New Roman" w:cs="Times New Roman"/>
-                <w:color w:val="385623" w:themeColor="accent6" w:themeShade="80"/>
-                <w:sz w:val="24"/>
-                <w:szCs w:val="24"/>
-              </w:rPr>
-              <w:t>Выйти</w:t>
+              </w:rPr>
+              <w:drawing>
+                <wp:inline distT="0" distB="0" distL="0" distR="0" wp14:anchorId="6E1B6B37" wp14:editId="2CED1B03">
+                  <wp:extent cx="2585357" cy="2321475"/>
+                  <wp:effectExtent l="0" t="0" r="5715" b="3175"/>
+                  <wp:docPr id="15" name="Рисунок 5">
+                    <a:extLst xmlns:a="http://schemas.openxmlformats.org/drawingml/2006/main">
+                      <a:ext uri="{FF2B5EF4-FFF2-40B4-BE49-F238E27FC236}">
+                        <a16:creationId xmlns:a16="http://schemas.microsoft.com/office/drawing/2014/main" id="{8DA2ECED-A16B-483F-8060-3BB60F39D5D1}"/>
+                      </a:ext>
+                    </a:extLst>
+                  </wp:docPr>
+                  <wp:cNvGraphicFramePr>
+                    <a:graphicFrameLocks xmlns:a="http://schemas.openxmlformats.org/drawingml/2006/main" noChangeAspect="1"/>
+                  </wp:cNvGraphicFramePr>
+                  <a:graphic xmlns:a="http://schemas.openxmlformats.org/drawingml/2006/main">
+                    <a:graphicData uri="http://schemas.openxmlformats.org/drawingml/2006/picture">
+                      <pic:pic xmlns:pic="http://schemas.openxmlformats.org/drawingml/2006/picture">
+                        <pic:nvPicPr>
+                          <pic:cNvPr id="6" name="Рисунок 5">
+                            <a:extLst>
+                              <a:ext uri="{FF2B5EF4-FFF2-40B4-BE49-F238E27FC236}">
+                                <a16:creationId xmlns:a16="http://schemas.microsoft.com/office/drawing/2014/main" id="{8DA2ECED-A16B-483F-8060-3BB60F39D5D1}"/>
+                              </a:ext>
+                            </a:extLst>
+                          </pic:cNvPr>
+                          <pic:cNvPicPr>
+                            <a:picLocks noChangeAspect="1"/>
+                          </pic:cNvPicPr>
+                        </pic:nvPicPr>
+                        <pic:blipFill rotWithShape="1">
+                          <a:blip r:embed="rId9">
+                            <a:extLst>
+                              <a:ext uri="{28A0092B-C50C-407E-A947-70E740481C1C}">
+                                <a14:useLocalDpi xmlns:a14="http://schemas.microsoft.com/office/drawing/2010/main" val="0"/>
+                              </a:ext>
+                            </a:extLst>
+                          </a:blip>
+                          <a:srcRect l="1654" t="5702" r="92678" b="85250"/>
+                          <a:stretch/>
+                        </pic:blipFill>
+                        <pic:spPr bwMode="auto">
+                          <a:xfrm>
+                            <a:off x="0" y="0"/>
+                            <a:ext cx="2585357" cy="2321475"/>
+                          </a:xfrm>
+                          <a:prstGeom prst="rect">
+                            <a:avLst/>
+                          </a:prstGeom>
+                        </pic:spPr>
+                      </pic:pic>
+                    </a:graphicData>
+                  </a:graphic>
+                </wp:inline>
+              </w:drawing>
             </w:r>
           </w:p>
           <w:p>
@@ -1332,9 +3104,9 @@
               <w:spacing w:line="360" w:lineRule="auto"/>
               <w:rPr>
                 <w:rFonts w:ascii="Times New Roman" w:eastAsia="Times New Roman" w:hAnsi="Times New Roman" w:cs="Times New Roman"/>
-                <w:color w:val="385623" w:themeColor="accent6" w:themeShade="80"/>
-                <w:sz w:val="24"/>
-                <w:szCs w:val="24"/>
+                <w:sz w:val="24"/>
+                <w:szCs w:val="24"/>
+                <w:lang w:val="en-US"/>
               </w:rPr>
             </w:pPr>
             <w:r>
@@ -1344,308 +3116,60 @@
                 <w:sz w:val="24"/>
                 <w:szCs w:val="24"/>
               </w:rPr>
-              <w:t>i . . . . . . . . . . . . . . .</w:t>
-            </w:r>
-          </w:p>
-          <w:p>
-            <w:pPr>
-              <w:spacing w:line="360" w:lineRule="auto"/>
-              <w:rPr>
-                <w:rFonts w:ascii="Times New Roman" w:eastAsia="Times New Roman" w:hAnsi="Times New Roman" w:cs="Times New Roman"/>
-                <w:color w:val="385623" w:themeColor="accent6" w:themeShade="80"/>
-                <w:sz w:val="24"/>
-                <w:szCs w:val="24"/>
-              </w:rPr>
-            </w:pPr>
-            <w:r>
-              <w:rPr>
-                <w:rFonts w:ascii="Times New Roman" w:eastAsia="Times New Roman" w:hAnsi="Times New Roman" w:cs="Times New Roman"/>
-                <w:color w:val="385623" w:themeColor="accent6" w:themeShade="80"/>
-                <w:sz w:val="24"/>
-                <w:szCs w:val="24"/>
-              </w:rPr>
-              <w:t>. . . . . . . . . . . . . . . .</w:t>
-            </w:r>
-          </w:p>
-          <w:p>
-            <w:pPr>
-              <w:spacing w:line="360" w:lineRule="auto"/>
-              <w:rPr>
-                <w:rFonts w:ascii="Times New Roman" w:eastAsia="Times New Roman" w:hAnsi="Times New Roman" w:cs="Times New Roman"/>
-                <w:color w:val="385623" w:themeColor="accent6" w:themeShade="80"/>
-                <w:sz w:val="24"/>
-                <w:szCs w:val="24"/>
-              </w:rPr>
-            </w:pPr>
-            <w:r>
-              <w:rPr>
-                <w:rFonts w:ascii="Times New Roman" w:eastAsia="Times New Roman" w:hAnsi="Times New Roman" w:cs="Times New Roman"/>
-                <w:color w:val="385623" w:themeColor="accent6" w:themeShade="80"/>
-                <w:sz w:val="24"/>
-                <w:szCs w:val="24"/>
-              </w:rPr>
-              <w:t>. . ■ ■ ■ ■ ■ ● ● ■ ■ ■ ■ ■ . .</w:t>
-            </w:r>
-          </w:p>
-          <w:p>
-            <w:pPr>
-              <w:spacing w:line="360" w:lineRule="auto"/>
-              <w:rPr>
-                <w:rFonts w:ascii="Times New Roman" w:eastAsia="Times New Roman" w:hAnsi="Times New Roman" w:cs="Times New Roman"/>
-                <w:color w:val="385623" w:themeColor="accent6" w:themeShade="80"/>
-                <w:sz w:val="24"/>
-                <w:szCs w:val="24"/>
-              </w:rPr>
-            </w:pPr>
-            <w:r>
-              <w:rPr>
-                <w:rFonts w:ascii="Times New Roman" w:eastAsia="Times New Roman" w:hAnsi="Times New Roman" w:cs="Times New Roman"/>
-                <w:color w:val="385623" w:themeColor="accent6" w:themeShade="80"/>
-                <w:sz w:val="24"/>
-                <w:szCs w:val="24"/>
-              </w:rPr>
-              <w:t>. . ■ . . . . . . . . . . ■ . .</w:t>
-            </w:r>
-          </w:p>
-          <w:p>
-            <w:pPr>
-              <w:spacing w:line="360" w:lineRule="auto"/>
-              <w:rPr>
-                <w:rFonts w:ascii="Times New Roman" w:eastAsia="Times New Roman" w:hAnsi="Times New Roman" w:cs="Times New Roman"/>
-                <w:color w:val="385623" w:themeColor="accent6" w:themeShade="80"/>
-                <w:sz w:val="24"/>
-                <w:szCs w:val="24"/>
-              </w:rPr>
-            </w:pPr>
-            <w:r>
-              <w:rPr>
-                <w:rFonts w:ascii="Times New Roman" w:eastAsia="Times New Roman" w:hAnsi="Times New Roman" w:cs="Times New Roman"/>
-                <w:color w:val="385623" w:themeColor="accent6" w:themeShade="80"/>
-                <w:sz w:val="24"/>
-                <w:szCs w:val="24"/>
-              </w:rPr>
-              <w:t>. . ■ . . . . . . . . . . ■ . .</w:t>
-            </w:r>
-          </w:p>
-          <w:p>
-            <w:pPr>
-              <w:spacing w:line="360" w:lineRule="auto"/>
-              <w:rPr>
-                <w:rFonts w:ascii="Times New Roman" w:eastAsia="Times New Roman" w:hAnsi="Times New Roman" w:cs="Times New Roman"/>
-                <w:color w:val="385623" w:themeColor="accent6" w:themeShade="80"/>
-                <w:sz w:val="24"/>
-                <w:szCs w:val="24"/>
-              </w:rPr>
-            </w:pPr>
-            <w:r>
-              <w:rPr>
-                <w:rFonts w:ascii="Times New Roman" w:eastAsia="Times New Roman" w:hAnsi="Times New Roman" w:cs="Times New Roman"/>
-                <w:color w:val="385623" w:themeColor="accent6" w:themeShade="80"/>
-                <w:sz w:val="24"/>
-                <w:szCs w:val="24"/>
-              </w:rPr>
-              <w:t>. . ■ . . . . . . . . . . ■ . .</w:t>
-            </w:r>
-          </w:p>
-          <w:p>
-            <w:pPr>
-              <w:spacing w:line="360" w:lineRule="auto"/>
-              <w:rPr>
-                <w:rFonts w:ascii="Times New Roman" w:eastAsia="Times New Roman" w:hAnsi="Times New Roman" w:cs="Times New Roman"/>
-                <w:color w:val="385623" w:themeColor="accent6" w:themeShade="80"/>
-                <w:sz w:val="24"/>
-                <w:szCs w:val="24"/>
-              </w:rPr>
-            </w:pPr>
-            <w:r>
-              <w:rPr>
-                <w:rFonts w:ascii="Times New Roman" w:eastAsia="Times New Roman" w:hAnsi="Times New Roman" w:cs="Times New Roman"/>
-                <w:color w:val="385623" w:themeColor="accent6" w:themeShade="80"/>
-                <w:sz w:val="24"/>
-                <w:szCs w:val="24"/>
-              </w:rPr>
-              <w:t>. . ■ . . . . . . . . . . ■ . .</w:t>
-            </w:r>
-          </w:p>
-          <w:p>
-            <w:pPr>
-              <w:spacing w:line="360" w:lineRule="auto"/>
-              <w:rPr>
-                <w:rFonts w:ascii="Times New Roman" w:eastAsia="Times New Roman" w:hAnsi="Times New Roman" w:cs="Times New Roman"/>
-                <w:color w:val="385623" w:themeColor="accent6" w:themeShade="80"/>
-                <w:sz w:val="24"/>
-                <w:szCs w:val="24"/>
-              </w:rPr>
-            </w:pPr>
-            <w:r>
-              <w:rPr>
-                <w:rFonts w:ascii="Times New Roman" w:eastAsia="Times New Roman" w:hAnsi="Times New Roman" w:cs="Times New Roman"/>
-                <w:color w:val="385623" w:themeColor="accent6" w:themeShade="80"/>
-                <w:sz w:val="24"/>
-                <w:szCs w:val="24"/>
-              </w:rPr>
-              <w:t>. . ■ . . . . . . . . . . ■ . .</w:t>
-            </w:r>
-          </w:p>
-          <w:p>
-            <w:pPr>
-              <w:spacing w:line="360" w:lineRule="auto"/>
-              <w:rPr>
-                <w:rFonts w:ascii="Times New Roman" w:eastAsia="Times New Roman" w:hAnsi="Times New Roman" w:cs="Times New Roman"/>
-                <w:color w:val="385623" w:themeColor="accent6" w:themeShade="80"/>
-                <w:sz w:val="24"/>
-                <w:szCs w:val="24"/>
-              </w:rPr>
-            </w:pPr>
-            <w:r>
-              <w:rPr>
-                <w:rFonts w:ascii="Times New Roman" w:eastAsia="Times New Roman" w:hAnsi="Times New Roman" w:cs="Times New Roman"/>
-                <w:color w:val="385623" w:themeColor="accent6" w:themeShade="80"/>
-                <w:sz w:val="24"/>
-                <w:szCs w:val="24"/>
-              </w:rPr>
-              <w:lastRenderedPageBreak/>
-              <w:t>. . ■ . . . . . . . . . . ■ . .</w:t>
-            </w:r>
-          </w:p>
-          <w:p>
-            <w:pPr>
-              <w:spacing w:line="360" w:lineRule="auto"/>
-              <w:rPr>
-                <w:rFonts w:ascii="Times New Roman" w:eastAsia="Times New Roman" w:hAnsi="Times New Roman" w:cs="Times New Roman"/>
-                <w:color w:val="385623" w:themeColor="accent6" w:themeShade="80"/>
-                <w:sz w:val="24"/>
-                <w:szCs w:val="24"/>
-              </w:rPr>
-            </w:pPr>
-            <w:r>
-              <w:rPr>
-                <w:rFonts w:ascii="Times New Roman" w:eastAsia="Times New Roman" w:hAnsi="Times New Roman" w:cs="Times New Roman"/>
-                <w:color w:val="385623" w:themeColor="accent6" w:themeShade="80"/>
-                <w:sz w:val="24"/>
-                <w:szCs w:val="24"/>
-              </w:rPr>
-              <w:t>. . ■ . . . ● . . . . . . ■ . .</w:t>
-            </w:r>
-          </w:p>
-          <w:p>
-            <w:pPr>
-              <w:spacing w:line="360" w:lineRule="auto"/>
-              <w:rPr>
-                <w:rFonts w:ascii="Times New Roman" w:eastAsia="Times New Roman" w:hAnsi="Times New Roman" w:cs="Times New Roman"/>
-                <w:color w:val="385623" w:themeColor="accent6" w:themeShade="80"/>
-                <w:sz w:val="24"/>
-                <w:szCs w:val="24"/>
-              </w:rPr>
-            </w:pPr>
-            <w:r>
-              <w:rPr>
-                <w:rFonts w:ascii="Times New Roman" w:eastAsia="Times New Roman" w:hAnsi="Times New Roman" w:cs="Times New Roman"/>
-                <w:color w:val="385623" w:themeColor="accent6" w:themeShade="80"/>
-                <w:sz w:val="24"/>
-                <w:szCs w:val="24"/>
-              </w:rPr>
-              <w:t>. . ■ . . . . . . . . . . ■ . .</w:t>
-            </w:r>
-          </w:p>
-          <w:p>
-            <w:pPr>
-              <w:spacing w:line="360" w:lineRule="auto"/>
-              <w:rPr>
-                <w:rFonts w:ascii="Times New Roman" w:eastAsia="Times New Roman" w:hAnsi="Times New Roman" w:cs="Times New Roman"/>
-                <w:color w:val="385623" w:themeColor="accent6" w:themeShade="80"/>
-                <w:sz w:val="24"/>
-                <w:szCs w:val="24"/>
-              </w:rPr>
-            </w:pPr>
-            <w:r>
-              <w:rPr>
-                <w:rFonts w:ascii="Times New Roman" w:eastAsia="Times New Roman" w:hAnsi="Times New Roman" w:cs="Times New Roman"/>
-                <w:color w:val="385623" w:themeColor="accent6" w:themeShade="80"/>
-                <w:sz w:val="24"/>
-                <w:szCs w:val="24"/>
-              </w:rPr>
-              <w:t>. . ■ . □ . . . . . . . . ■ . .</w:t>
-            </w:r>
-          </w:p>
-          <w:p>
-            <w:pPr>
-              <w:spacing w:line="360" w:lineRule="auto"/>
-              <w:rPr>
-                <w:rFonts w:ascii="Times New Roman" w:eastAsia="Times New Roman" w:hAnsi="Times New Roman" w:cs="Times New Roman"/>
-                <w:color w:val="385623" w:themeColor="accent6" w:themeShade="80"/>
-                <w:sz w:val="24"/>
-                <w:szCs w:val="24"/>
-              </w:rPr>
-            </w:pPr>
-            <w:r>
-              <w:rPr>
-                <w:rFonts w:ascii="Times New Roman" w:eastAsia="Times New Roman" w:hAnsi="Times New Roman" w:cs="Times New Roman"/>
-                <w:color w:val="385623" w:themeColor="accent6" w:themeShade="80"/>
-                <w:sz w:val="24"/>
-                <w:szCs w:val="24"/>
-              </w:rPr>
-              <w:t>. . ■ . . . . . . . . . ! ■ . .</w:t>
-            </w:r>
-          </w:p>
-          <w:p>
-            <w:pPr>
-              <w:spacing w:line="360" w:lineRule="auto"/>
-              <w:rPr>
-                <w:rFonts w:ascii="Times New Roman" w:eastAsia="Times New Roman" w:hAnsi="Times New Roman" w:cs="Times New Roman"/>
-                <w:color w:val="385623" w:themeColor="accent6" w:themeShade="80"/>
-                <w:sz w:val="24"/>
-                <w:szCs w:val="24"/>
-              </w:rPr>
-            </w:pPr>
-            <w:r>
-              <w:rPr>
-                <w:rFonts w:ascii="Times New Roman" w:eastAsia="Times New Roman" w:hAnsi="Times New Roman" w:cs="Times New Roman"/>
-                <w:color w:val="385623" w:themeColor="accent6" w:themeShade="80"/>
-                <w:sz w:val="24"/>
-                <w:szCs w:val="24"/>
-              </w:rPr>
-              <w:t>. . ■ ■ ■ ■ ■ ■ ■ ■ ■ ■ ■ ■ . .</w:t>
-            </w:r>
-          </w:p>
-          <w:p>
-            <w:pPr>
-              <w:spacing w:line="360" w:lineRule="auto"/>
-              <w:rPr>
-                <w:rFonts w:ascii="Times New Roman" w:eastAsia="Times New Roman" w:hAnsi="Times New Roman" w:cs="Times New Roman"/>
-                <w:color w:val="385623" w:themeColor="accent6" w:themeShade="80"/>
-                <w:sz w:val="24"/>
-                <w:szCs w:val="24"/>
-              </w:rPr>
-            </w:pPr>
-            <w:r>
-              <w:rPr>
-                <w:rFonts w:ascii="Times New Roman" w:eastAsia="Times New Roman" w:hAnsi="Times New Roman" w:cs="Times New Roman"/>
-                <w:color w:val="385623" w:themeColor="accent6" w:themeShade="80"/>
-                <w:sz w:val="24"/>
-                <w:szCs w:val="24"/>
-              </w:rPr>
-              <w:t>. . . . . . . . . . . . . . . .</w:t>
-            </w:r>
-          </w:p>
-          <w:p>
-            <w:pPr>
-              <w:spacing w:line="360" w:lineRule="auto"/>
-              <w:rPr>
-                <w:rFonts w:ascii="Times New Roman" w:eastAsia="Times New Roman" w:hAnsi="Times New Roman" w:cs="Times New Roman"/>
-                <w:sz w:val="24"/>
-                <w:szCs w:val="24"/>
-                <w:lang w:val="en-US"/>
-              </w:rPr>
-            </w:pPr>
-            <w:r>
-              <w:rPr>
-                <w:rFonts w:ascii="Times New Roman" w:eastAsia="Times New Roman" w:hAnsi="Times New Roman" w:cs="Times New Roman"/>
-                <w:color w:val="385623" w:themeColor="accent6" w:themeShade="80"/>
-                <w:sz w:val="24"/>
-                <w:szCs w:val="24"/>
-              </w:rPr>
-              <w:t>. . . . . . . . . . . . . . . .</w:t>
+              <w:drawing>
+                <wp:inline distT="0" distB="0" distL="0" distR="0" wp14:anchorId="7620EEE2" wp14:editId="68794983">
+                  <wp:extent cx="2275114" cy="2331804"/>
+                  <wp:effectExtent l="0" t="0" r="0" b="0"/>
+                  <wp:docPr id="16" name="Рисунок 7">
+                    <a:extLst xmlns:a="http://schemas.openxmlformats.org/drawingml/2006/main">
+                      <a:ext uri="{FF2B5EF4-FFF2-40B4-BE49-F238E27FC236}">
+                        <a16:creationId xmlns:a16="http://schemas.microsoft.com/office/drawing/2014/main" id="{CBB109DD-80B9-418D-BE37-B23321A92108}"/>
+                      </a:ext>
+                    </a:extLst>
+                  </wp:docPr>
+                  <wp:cNvGraphicFramePr>
+                    <a:graphicFrameLocks xmlns:a="http://schemas.openxmlformats.org/drawingml/2006/main" noChangeAspect="1"/>
+                  </wp:cNvGraphicFramePr>
+                  <a:graphic xmlns:a="http://schemas.openxmlformats.org/drawingml/2006/main">
+                    <a:graphicData uri="http://schemas.openxmlformats.org/drawingml/2006/picture">
+                      <pic:pic xmlns:pic="http://schemas.openxmlformats.org/drawingml/2006/picture">
+                        <pic:nvPicPr>
+                          <pic:cNvPr id="8" name="Рисунок 7">
+                            <a:extLst>
+                              <a:ext uri="{FF2B5EF4-FFF2-40B4-BE49-F238E27FC236}">
+                                <a16:creationId xmlns:a16="http://schemas.microsoft.com/office/drawing/2014/main" id="{CBB109DD-80B9-418D-BE37-B23321A92108}"/>
+                              </a:ext>
+                            </a:extLst>
+                          </pic:cNvPr>
+                          <pic:cNvPicPr>
+                            <a:picLocks noChangeAspect="1"/>
+                          </pic:cNvPicPr>
+                        </pic:nvPicPr>
+                        <pic:blipFill rotWithShape="1">
+                          <a:blip r:embed="rId10">
+                            <a:extLst>
+                              <a:ext uri="{28A0092B-C50C-407E-A947-70E740481C1C}">
+                                <a14:useLocalDpi xmlns:a14="http://schemas.microsoft.com/office/drawing/2010/main" val="0"/>
+                              </a:ext>
+                            </a:extLst>
+                          </a:blip>
+                          <a:srcRect l="1473" t="5324" r="84732" b="69541"/>
+                          <a:stretch/>
+                        </pic:blipFill>
+                        <pic:spPr bwMode="auto">
+                          <a:xfrm>
+                            <a:off x="0" y="0"/>
+                            <a:ext cx="2275114" cy="2331804"/>
+                          </a:xfrm>
+                          <a:prstGeom prst="rect">
+                            <a:avLst/>
+                          </a:prstGeom>
+                        </pic:spPr>
+                      </pic:pic>
+                    </a:graphicData>
+                  </a:graphic>
+                </wp:inline>
+              </w:drawing>
             </w:r>
           </w:p>
         </w:tc>
@@ -1686,7 +3210,6 @@
                 <w:rFonts w:ascii="Times New Roman" w:eastAsia="Times New Roman" w:hAnsi="Times New Roman" w:cs="Times New Roman"/>
                 <w:sz w:val="24"/>
                 <w:szCs w:val="24"/>
-                <w:lang w:val="en-US"/>
               </w:rPr>
             </w:pPr>
             <w:r>
@@ -1712,10 +3235,10 @@
     </w:tbl>
     <w:p/>
     <w:sectPr>
-      <w:headerReference w:type="default" r:id="rId9"/>
-      <w:footerReference w:type="default" r:id="rId10"/>
-      <w:headerReference w:type="first" r:id="rId11"/>
-      <w:footerReference w:type="first" r:id="rId12"/>
+      <w:headerReference w:type="default" r:id="rId11"/>
+      <w:footerReference w:type="default" r:id="rId12"/>
+      <w:headerReference w:type="first" r:id="rId13"/>
+      <w:footerReference w:type="first" r:id="rId14"/>
       <w:pgSz w:w="11906" w:h="16838"/>
       <w:pgMar w:top="567" w:right="567" w:bottom="567" w:left="1418" w:header="709" w:footer="709" w:gutter="0"/>
       <w:cols w:space="708"/>

</xml_diff>